<commit_message>
Unificar el firmware del ESP32 en un solo programa
esp32/control_trama_esp32 pasa a ser el único firmware de la placa, con un
solo config.h. NIVEL2_INSTALADO (false por defecto) decide si además de la
botonera maneja el sensor de pasada y la selección del dibujo; en false
consulta con origen=esp32 para que la web siga estimando las pasadas. Se
elimina esp32/nivel2 y se actualizan pruebas, coherencia y documentación.

Co-Authored-By: Claude Opus 5.5 <noreply@anthropic.com>
Claude-Session: https://claude.ai/code/session_01QiY8ZZNAM9gwPKiqSkCaaj
</commit_message>
<xml_diff>
--- a/documentacion_proyecto/Guia_Conexion_Reles_LCA110.docx
+++ b/documentacion_proyecto/Guia_Conexion_Reles_LCA110.docx
@@ -4704,7 +4704,7 @@
           <w:sz w:val="19"/>
           <w:szCs w:val="19"/>
         </w:rPr>
-        <w:t xml:space="preserve">config_nivel2.h</w:t>
+        <w:t xml:space="preserve">control_trama_esp32/config.h</w:t>
       </w:r>
       <w:r>
         <w:rPr>
@@ -4720,7 +4720,7 @@
           <w:sz w:val="19"/>
           <w:szCs w:val="19"/>
         </w:rPr>
-        <w:t xml:space="preserve">MODO_BANCO true</w:t>
+        <w:t xml:space="preserve">NIVEL2_INSTALADO true y MODO_BANCO true</w:t>
       </w:r>
       <w:r>
         <w:rPr>
@@ -4746,7 +4746,7 @@
           <w:sz w:val="21"/>
           <w:szCs w:val="21"/>
         </w:rPr>
-        <w:t xml:space="preserve">Cargá un dibujo con la fila 1 marcada en la columna 1 y 25 repeticiones, y la fila 2 vacía con otras 25, y tocá ▶ en la web: los pulsos simulados corren solo con el telar en «Tejiendo». Hace falta la red y el backend, igual que en la máquina (WiFi, API_BASE_URL, DEVICE_KEY y TELAR_ID en config_nivel2.h). Como el mismo ESP32 maneja también los relés de Marcha, Pausa y Retroceder (es una sola placa), ▶ pulsa el relé de Marcha: si esos relés están conectados a la botonera, arranca la máquina. Para esta prueba, desconectalos de la botonera.</w:t>
+        <w:t xml:space="preserve">Cargá un dibujo con la fila 1 marcada en la columna 1 y 25 repeticiones, y la fila 2 vacía con otras 25, y tocá ▶ en la web: los pulsos simulados corren solo con el telar en «Tejiendo». Hace falta la red y el backend, igual que en la máquina (WiFi, API_BASE_URL, DEVICE_KEY y TELAR_ID en control_trama_esp32/config.h). Como el mismo ESP32 maneja también los relés de Marcha, Pausa y Retroceder (es una sola placa), ▶ pulsa el relé de Marcha: si esos relés están conectados a la botonera, arranca la máquina. Para esta prueba, desconectalos de la botonera.</w:t>
       </w:r>
     </w:p>
     <w:p>
@@ -4820,7 +4820,7 @@
           <w:sz w:val="21"/>
           <w:szCs w:val="21"/>
         </w:rPr>
-        <w:t xml:space="preserve">Volvé a poner MODO_BANCO false</w:t>
+        <w:t xml:space="preserve">Volvé a poner MODO_BANCO false (y NIVEL2_INSTALADO false si el sensor todavía no está conectado)</w:t>
       </w:r>
       <w:r>
         <w:rPr>
@@ -6256,7 +6256,7 @@
                 <w:sz w:val="19"/>
                 <w:szCs w:val="19"/>
               </w:rPr>
-              <w:t xml:space="preserve">Cambiar a CANAL_ACTIVO_EN_ALTO = false en config_nivel2.h</w:t>
+              <w:t xml:space="preserve">Cambiar a CANAL_ACTIVO_EN_ALTO = false en control_trama_esp32/config.h</w:t>
             </w:r>
           </w:p>
         </w:tc>
@@ -6566,7 +6566,7 @@
           <w:sz w:val="19"/>
           <w:szCs w:val="19"/>
         </w:rPr>
-        <w:t xml:space="preserve">config_nivel2.h</w:t>
+        <w:t xml:space="preserve">control_trama_esp32/config.h</w:t>
       </w:r>
       <w:r>
         <w:rPr>
@@ -6692,7 +6692,7 @@
           <w:sz w:val="19"/>
           <w:szCs w:val="19"/>
         </w:rPr>
-        <w:t xml:space="preserve">config_nivel2.h</w:t>
+        <w:t xml:space="preserve">control_trama_esp32/config.h</w:t>
       </w:r>
       <w:r>
         <w:rPr>

</xml_diff>

<commit_message>
Revisión: punto de miles en el hilado, intercalar sobre un dibujo vacío, pruebas del editor y guía de los relés
Co-Authored-By: Claude Opus 5.5 <noreply@anthropic.com>
Claude-Session: https://claude.ai/code/session_01QiY8ZZNAM9gwPKiqSkCaaj
</commit_message>
<xml_diff>
--- a/documentacion_proyecto/Guia_Conexion_Reles_LCA110.docx
+++ b/documentacion_proyecto/Guia_Conexion_Reles_LCA110.docx
@@ -56,7 +56,7 @@
           <w:sz w:val="21"/>
           <w:szCs w:val="21"/>
         </w:rPr>
-        <w:t xml:space="preserve">Esta guía explica cómo conectar los cuatro relés de estado sólido LCA110 que le permiten al ESP32 del Nivel 2 elegir, pasada por pasada, qué bobinas de selección se activan. Cubre el orden de trabajo, la seguridad, las mediciones previas, las conexiones de cada lado, las pruebas y los problemas más frecuentes.</w:t>
+        <w:t xml:space="preserve">Esta guía explica cómo conectar los cuatro relés de estado sólido LCA110 que le permiten al ESP32 del Nivel 2 elegir, pasada por pasada, qué bobina de selección se activa (una por pasada, porque en cada pasada entra una sola trama). Cubre el orden de trabajo, la seguridad, las mediciones previas, las conexiones de cada lado, las pruebas y los problemas más frecuentes.</w:t>
       </w:r>
     </w:p>
     <w:p>
@@ -118,7 +118,7 @@
           <w:sz w:val="21"/>
           <w:szCs w:val="21"/>
         </w:rPr>
-        <w:t xml:space="preserve">, aunque la misma combinación se repita: entre dos agujeros seguidos de la misma columna hay papel. Una fila con 25 repeticiones son 25 activaciones separadas, no una sola larga. Cuánto dura cada activación lo define el firmware (sección 10).</w:t>
+        <w:t xml:space="preserve">, aunque la misma bobina se repita: entre dos agujeros seguidos de la misma columna hay papel. Una fila con 25 repeticiones son 25 activaciones separadas, no una sola larga. Cuánto dura cada activación lo define el firmware (sección 10).</w:t>
       </w:r>
     </w:p>
     <w:p>
@@ -6468,6 +6468,22 @@
               <w:t xml:space="preserve">con el ESP32 apagado o reiniciándose, los cuatro canales se leen como agujero, así que no hay que tejer con el Nivel 2 apagado. La conexión en paralelo no tiene este problema, porque con el ESP32 apagado la máquina vuelve a depender del lector.</w:t>
             </w:r>
           </w:p>
+          <w:p>
+            <w:pPr>
+              <w:spacing w:after="0" w:line="280"/>
+            </w:pPr>
+            <w:r>
+              <w:rPr>
+                <w:rFonts w:ascii="IBM Plex Sans" w:cs="IBM Plex Sans" w:eastAsia="IBM Plex Sans" w:hAnsi="IBM Plex Sans"/>
+                <w:b/>
+                <w:bCs/>
+                <w:color w:val="9C5C0A"/>
+                <w:sz w:val="21"/>
+                <w:szCs w:val="21"/>
+              </w:rPr>
+              <w:t xml:space="preserve">Otra opción es sacar el lector y conectar el relé en su lugar, directo a los bornes de la plaqueta. Ahí la conexión depende de quién pone la tensión de la señal: si la pone la plaqueta, el relé va entre los 2 bornes de señal (caso 1); si la ponía el lector, el relé va entre el + y la señal (caso 2A, el agujero es +V) o entre la señal y el − (caso 2B, el agujero es 0 V), con una resistencia de 10 kΩ ½ W que deja la señal en «papel» con el relé abierto. El paso a paso de la medición y los diagramas de los tres casos están en esp32/documentacion/PASO_A_PASO_RELES_LCA110.md y en diagramas/hardware (diagrama_bloque_D_caso1, caso2A y caso2B).</w:t>
+            </w:r>
+          </w:p>
         </w:tc>
       </w:tr>
     </w:tbl>
@@ -6871,6 +6887,19 @@
           <w:szCs w:val="21"/>
         </w:rPr>
         <w:t xml:space="preserve">El relé casi no se desgasta: lo que suele fallar en una fábrica es todo lo que lo rodea. Para que dure:</w:t>
+      </w:r>
+    </w:p>
+    <w:p>
+      <w:pPr>
+        <w:spacing w:after="120" w:line="290"/>
+      </w:pPr>
+      <w:r>
+        <w:rPr>
+          <w:rFonts w:ascii="IBM Plex Sans" w:cs="IBM Plex Sans" w:eastAsia="IBM Plex Sans" w:hAnsi="IBM Plex Sans"/>
+          <w:sz w:val="21"/>
+          <w:szCs w:val="21"/>
+        </w:rPr>
+        <w:t xml:space="preserve">Estado al 10/10/2026: el circuito se probó en protoboard con el ESP32 y funcionó. Se está haciendo la plaqueta para la prueba definitiva, con tiras de pines para enchufar el ESP32, los módulos y los cables sin soldarlos.</w:t>
       </w:r>
     </w:p>
     <w:p>

</xml_diff>

<commit_message>
Firmware: la selección queda activa mientras la bobina se repite (PORCENTAJE_SELECCION en 0 por defecto); guías y pruebas al día
Co-Authored-By: Claude Opus 5.5 <noreply@anthropic.com>
Claude-Session: https://claude.ai/code/session_01QiY8ZZNAM9gwPKiqSkCaaj
</commit_message>
<xml_diff>
--- a/documentacion_proyecto/Guia_Conexion_Reles_LCA110.docx
+++ b/documentacion_proyecto/Guia_Conexion_Reles_LCA110.docx
@@ -100,7 +100,7 @@
           <w:sz w:val="21"/>
           <w:szCs w:val="21"/>
         </w:rPr>
-        <w:t xml:space="preserve">Como con el papel, </w:t>
+        <w:t xml:space="preserve">Con el firmware tal como viene, </w:t>
       </w:r>
       <w:r>
         <w:rPr>
@@ -110,15 +110,15 @@
           <w:sz w:val="21"/>
           <w:szCs w:val="21"/>
         </w:rPr>
-        <w:t xml:space="preserve">en cada pasada el relé se cierra y se suelta</w:t>
-      </w:r>
-      <w:r>
-        <w:rPr>
-          <w:rFonts w:ascii="IBM Plex Sans" w:cs="IBM Plex Sans" w:eastAsia="IBM Plex Sans" w:hAnsi="IBM Plex Sans"/>
-          <w:sz w:val="21"/>
-          <w:szCs w:val="21"/>
-        </w:rPr>
-        <w:t xml:space="preserve">, aunque la misma bobina se repita: entre dos agujeros seguidos de la misma columna hay papel. Una fila con 25 repeticiones son 25 activaciones separadas, no una sola larga. Cuánto dura cada activación lo define el firmware (sección 10).</w:t>
+        <w:t xml:space="preserve">el relé queda cerrado mientras la misma bobina se repite</w:t>
+      </w:r>
+      <w:r>
+        <w:rPr>
+          <w:rFonts w:ascii="IBM Plex Sans" w:cs="IBM Plex Sans" w:eastAsia="IBM Plex Sans" w:hAnsi="IBM Plex Sans"/>
+          <w:sz w:val="21"/>
+          <w:szCs w:val="21"/>
+        </w:rPr>
+        <w:t xml:space="preserve">: una fila con 25 repeticiones es una sola activación larga, y el relé cambia recién cuando cambia la bobina. Con el papel, en cambio, la señal se suelta entre dos pasadas (entre dos agujeros seguidos de la misma columna hay papel); si la máquina lo necesitara, el firmware también puede soltarla en cada pasada (sección 10).</w:t>
       </w:r>
     </w:p>
     <w:p>
@@ -4588,7 +4588,7 @@
           <w:sz w:val="21"/>
           <w:szCs w:val="21"/>
         </w:rPr>
-        <w:t xml:space="preserve">El multímetro confirma que el relé conmuta, pero no alcanza a mostrar lo que hace el firmware: el relé se cierra y se suelta unas cinco veces por segundo. Para verlo se usa un LED del lado de la salida, con su propia pila:</w:t>
+        <w:t xml:space="preserve">El multímetro confirma que el relé conmuta, pero no alcanza a mostrar lo que hace el firmware: el relé cambia al ritmo de las pasadas, cinco por segundo. Para verlo se usa un LED del lado de la salida, con su propia pila:</w:t>
       </w:r>
     </w:p>
     <w:p>
@@ -4774,15 +4774,15 @@
           <w:sz w:val="21"/>
           <w:szCs w:val="21"/>
         </w:rPr>
-        <w:t xml:space="preserve">el LED parpadea unas cinco veces por segundo durante 5 segundos</w:t>
-      </w:r>
-      <w:r>
-        <w:rPr>
-          <w:rFonts w:ascii="IBM Plex Sans" w:cs="IBM Plex Sans" w:eastAsia="IBM Plex Sans" w:hAnsi="IBM Plex Sans"/>
-          <w:sz w:val="21"/>
-          <w:szCs w:val="21"/>
-        </w:rPr>
-        <w:t xml:space="preserve"> (una vez por pasada) y después </w:t>
+        <w:t xml:space="preserve">el LED queda encendido fijo 5 segundos</w:t>
+      </w:r>
+      <w:r>
+        <w:rPr>
+          <w:rFonts w:ascii="IBM Plex Sans" w:cs="IBM Plex Sans" w:eastAsia="IBM Plex Sans" w:hAnsi="IBM Plex Sans"/>
+          <w:sz w:val="21"/>
+          <w:szCs w:val="21"/>
+        </w:rPr>
+        <w:t xml:space="preserve"> (las 25 pasadas de la fila 1, sin apagarse entre una y otra) y después </w:t>
       </w:r>
       <w:r>
         <w:rPr>
@@ -4800,7 +4800,7 @@
           <w:sz w:val="21"/>
           <w:szCs w:val="21"/>
         </w:rPr>
-        <w:t xml:space="preserve">, y así sucesivamente. Si en vez de parpadear queda encendido fijo, la placa tiene un firmware viejo: cargá el actual.</w:t>
+        <w:t xml:space="preserve"> (las 25 de la fila 2), y así sucesivamente. Si PORCENTAJE_SELECCION no está en 0, el LED parpadea cinco veces por segundo durante esos 5 segundos (se suelta en cada pasada): también está bien, es la otra forma de trabajar.</w:t>
       </w:r>
     </w:p>
     <w:p>
@@ -6732,7 +6732,7 @@
           <w:sz w:val="21"/>
           <w:szCs w:val="21"/>
         </w:rPr>
-        <w:t xml:space="preserve"> (hoy 50 %) dice qué parte de cada pasada queda cerrado el relé, y se adapta solo a la velocidad. </w:t>
+        <w:t xml:space="preserve"> viene en 0: el relé queda cerrado mientras la misma bobina se repite (por ejemplo, 120 pasadas seguidas de la bobina 1) y cambia recién cuando cambia la bobina. Si se pone entre 1 y 90, el relé se suelta en cada pasada, como hace el papel, y queda cerrado ese porcentaje de la pasada, adaptándose solo a la velocidad. </w:t>
       </w:r>
       <w:r>
         <w:rPr>
@@ -6768,7 +6768,7 @@
           <w:sz w:val="21"/>
           <w:szCs w:val="21"/>
         </w:rPr>
-        <w:t xml:space="preserve">Estimá el porcentaje con una regla sobre la cinta de papel:</w:t>
+        <w:t xml:space="preserve">Si la máquina necesitara que la señal se suelte en cada pasada, estimá el porcentaje con una regla sobre la cinta de papel:</w:t>
       </w:r>
       <w:r>
         <w:rPr>
@@ -6822,7 +6822,7 @@
           <w:sz w:val="21"/>
           <w:szCs w:val="21"/>
         </w:rPr>
-        <w:t xml:space="preserve">Si alguna pasada no toma la selección, subí el porcentaje de a 10 (hasta 90). Si el dibujo sale corrido una pasada, ajustá </w:t>
+        <w:t xml:space="preserve">Si con 0 alguna pasada no toma la selección, cargá el porcentaje medido (por ejemplo 50) y, si sigue pasando, subilo de a 10 (hasta 90). Si el dibujo sale corrido una pasada, ajustá </w:t>
       </w:r>
       <w:r>
         <w:rPr>
@@ -7847,7 +7847,7 @@
                 <w:sz w:val="19"/>
                 <w:szCs w:val="19"/>
               </w:rPr>
-              <w:t xml:space="preserve">Firmware viejo, que sostenía la selección en vez de soltarla en cada pasada</w:t>
+              <w:t xml:space="preserve">La máquina necesita que la señal se suelte entre pasadas, como con el papel</w:t>
             </w:r>
           </w:p>
         </w:tc>
@@ -7880,7 +7880,7 @@
                 <w:sz w:val="19"/>
                 <w:szCs w:val="19"/>
               </w:rPr>
-              <w:t xml:space="preserve">Cargar el firmware actual; el LED de la prueba en la mesa tiene que parpadear</w:t>
+              <w:t xml:space="preserve">Poner PORCENTAJE_SELECCION en 50 (o el valor medido con la regla); el LED de la prueba en la mesa pasa a parpadear</w:t>
             </w:r>
           </w:p>
         </w:tc>
@@ -7952,7 +7952,7 @@
                 <w:sz w:val="19"/>
                 <w:szCs w:val="19"/>
               </w:rPr>
-              <w:t xml:space="preserve">La selección dura poco para la máquina</w:t>
+              <w:t xml:space="preserve">Con un porcentaje, la selección dura poco para la máquina</w:t>
             </w:r>
           </w:p>
         </w:tc>
@@ -7985,7 +7985,7 @@
                 <w:sz w:val="19"/>
                 <w:szCs w:val="19"/>
               </w:rPr>
-              <w:t xml:space="preserve">Subir PORCENTAJE_SELECCION de a 10, hasta 90</w:t>
+              <w:t xml:space="preserve">Subir PORCENTAJE_SELECCION de a 10, hasta 90 (o volver a 0, que la mantiene)</w:t>
             </w:r>
           </w:p>
         </w:tc>
@@ -8143,7 +8143,7 @@
           <w:sz w:val="21"/>
           <w:szCs w:val="21"/>
         </w:rPr>
-        <w:t xml:space="preserve">Cada relé probado en la mesa antes de colocarlo, y la prueba con el firmware y el LED hecha (el LED parpadea en cada pasada).</w:t>
+        <w:t xml:space="preserve">Cada relé probado en la mesa antes de colocarlo, y la prueba con el firmware y el LED hecha (el LED queda encendido mientras la bobina se repite).</w:t>
       </w:r>
     </w:p>
     <w:p>

</xml_diff>

<commit_message>
Relés: conexión final (la más segura) con resistencia de protección
- Diagrama nuevo conexion_final_rele.svg/png: el relé en el lugar del
  lector (caso 2A), resistencia de protección en serie, 10 kΩ ½ W de la
  señal al negativo, qué pasa en cada situación y comprobaciones.
- Diagramas 2A/2B y canal_rele_sin_sensor con la resistencia de protección.
- Paso a paso, config.h (comentarios), README, Nivel 2, recomendaciones,
  puesta en marcha, Guía LCA110 y Guía de mediciones apuntan a la conexión
  final. Dato de la planta: el relé se mantiene activo y la aguja va y
  vuelve igual en cada pasada (PORCENTAJE_SELECCION 0).

Co-Authored-By: Claude Opus 5.5 <noreply@anthropic.com>
Claude-Session: https://claude.ai/code/session_01QiY8ZZNAM9gwPKiqSkCaaj
</commit_message>
<xml_diff>
--- a/documentacion_proyecto/Guia_Conexion_Reles_LCA110.docx
+++ b/documentacion_proyecto/Guia_Conexion_Reles_LCA110.docx
@@ -2664,27 +2664,27 @@
               <w:bottom w:val="single" w:color="CDD8E0" w:sz="4"/>
               <w:right w:val="single" w:color="CDD8E0" w:sz="4"/>
             </w:tcBorders>
-            <w:shd w:fill="FFFFFF" w:color="auto" w:val="clear"/>
-            <w:tcMar>
-              <w:top w:type="dxa" w:w="70"/>
-              <w:left w:type="dxa" w:w="110"/>
-              <w:bottom w:type="dxa" w:w="70"/>
-              <w:right w:type="dxa" w:w="110"/>
-            </w:tcMar>
-          </w:tcPr>
-          <w:p>
-            <w:pPr>
-              <w:keepNext/>
-              <w:keepLines/>
-              <w:spacing w:after="0" w:line="260"/>
-            </w:pPr>
-            <w:r>
-              <w:rPr>
-                <w:rFonts w:ascii="IBM Plex Sans" w:cs="IBM Plex Sans" w:eastAsia="IBM Plex Sans" w:hAnsi="IBM Plex Sans"/>
-                <w:sz w:val="19"/>
-                <w:szCs w:val="19"/>
-              </w:rPr>
-              <w:t xml:space="preserve">Bornera de 2 o 3 vías</w:t>
+            <w:shd w:fill="EDF1F5" w:color="auto" w:val="clear"/>
+            <w:tcMar>
+              <w:top w:type="dxa" w:w="70"/>
+              <w:left w:type="dxa" w:w="110"/>
+              <w:bottom w:type="dxa" w:w="70"/>
+              <w:right w:type="dxa" w:w="110"/>
+            </w:tcMar>
+          </w:tcPr>
+          <w:p>
+            <w:pPr>
+              <w:keepNext/>
+              <w:keepLines/>
+              <w:spacing w:after="0" w:line="260"/>
+            </w:pPr>
+            <w:r>
+              <w:rPr>
+                <w:rFonts w:ascii="IBM Plex Sans" w:cs="IBM Plex Sans" w:eastAsia="IBM Plex Sans" w:hAnsi="IBM Plex Sans"/>
+                <w:sz w:val="19"/>
+                <w:szCs w:val="19"/>
+              </w:rPr>
+              <w:t xml:space="preserve">Resistencia de 10 kΩ, 1/2 W</w:t>
             </w:r>
           </w:p>
         </w:tc>
@@ -2697,7 +2697,7 @@
               <w:bottom w:val="single" w:color="CDD8E0" w:sz="4"/>
               <w:right w:val="single" w:color="CDD8E0" w:sz="4"/>
             </w:tcBorders>
-            <w:shd w:fill="FFFFFF" w:color="auto" w:val="clear"/>
+            <w:shd w:fill="EDF1F5" w:color="auto" w:val="clear"/>
             <w:tcMar>
               <w:top w:type="dxa" w:w="70"/>
               <w:left w:type="dxa" w:w="110"/>
@@ -2730,27 +2730,27 @@
               <w:bottom w:val="single" w:color="CDD8E0" w:sz="4"/>
               <w:right w:val="single" w:color="CDD8E0" w:sz="4"/>
             </w:tcBorders>
-            <w:shd w:fill="FFFFFF" w:color="auto" w:val="clear"/>
-            <w:tcMar>
-              <w:top w:type="dxa" w:w="70"/>
-              <w:left w:type="dxa" w:w="110"/>
-              <w:bottom w:type="dxa" w:w="70"/>
-              <w:right w:type="dxa" w:w="110"/>
-            </w:tcMar>
-          </w:tcPr>
-          <w:p>
-            <w:pPr>
-              <w:keepNext/>
-              <w:keepLines/>
-              <w:spacing w:after="0" w:line="260"/>
-            </w:pPr>
-            <w:r>
-              <w:rPr>
-                <w:rFonts w:ascii="IBM Plex Sans" w:cs="IBM Plex Sans" w:eastAsia="IBM Plex Sans" w:hAnsi="IBM Plex Sans"/>
-                <w:sz w:val="19"/>
-                <w:szCs w:val="19"/>
-              </w:rPr>
-              <w:t xml:space="preserve">Conexión desmontable hacia cada lector. Con 3 vías se usan los bornes de los extremos y el del medio queda libre</w:t>
+            <w:shd w:fill="EDF1F5" w:color="auto" w:val="clear"/>
+            <w:tcMar>
+              <w:top w:type="dxa" w:w="70"/>
+              <w:left w:type="dxa" w:w="110"/>
+              <w:bottom w:type="dxa" w:w="70"/>
+              <w:right w:type="dxa" w:w="110"/>
+            </w:tcMar>
+          </w:tcPr>
+          <w:p>
+            <w:pPr>
+              <w:keepNext/>
+              <w:keepLines/>
+              <w:spacing w:after="0" w:line="260"/>
+            </w:pPr>
+            <w:r>
+              <w:rPr>
+                <w:rFonts w:ascii="IBM Plex Sans" w:cs="IBM Plex Sans" w:eastAsia="IBM Plex Sans" w:hAnsi="IBM Plex Sans"/>
+                <w:sz w:val="19"/>
+                <w:szCs w:val="19"/>
+              </w:rPr>
+              <w:t xml:space="preserve">Lado del telar: deja la señal en 0 V (papel) con el relé abierto</w:t>
             </w:r>
           </w:p>
         </w:tc>
@@ -2789,7 +2789,7 @@
                 <w:sz w:val="19"/>
                 <w:szCs w:val="19"/>
               </w:rPr>
-              <w:t xml:space="preserve">LED, resistencia y pila</w:t>
+              <w:t xml:space="preserve">Resistencia de protección: 220 Ω 1 W (lector de hasta 15 V) o 470 Ω 2 W (de 15 a 30 V)</w:t>
             </w:r>
           </w:p>
         </w:tc>
@@ -2822,7 +2822,7 @@
                 <w:sz w:val="19"/>
                 <w:szCs w:val="19"/>
               </w:rPr>
-              <w:t xml:space="preserve">1 de cada</w:t>
+              <w:t xml:space="preserve">4</w:t>
             </w:r>
           </w:p>
         </w:tc>
@@ -2855,7 +2855,7 @@
                 <w:sz w:val="19"/>
                 <w:szCs w:val="19"/>
               </w:rPr>
-              <w:t xml:space="preserve">Prueba en la mesa con el firmware (sección 6). Con pila de 9 V, resistencia de 680 Ω; con dos pilas AA, de 100 Ω</w:t>
+              <w:t xml:space="preserve">Lado del telar, en serie con el relé: limita la corriente ante un error de cableado</w:t>
             </w:r>
           </w:p>
         </w:tc>
@@ -2894,7 +2894,7 @@
                 <w:sz w:val="19"/>
                 <w:szCs w:val="19"/>
               </w:rPr>
-              <w:t xml:space="preserve">Cable, cinta para marcar y termocontraíble</w:t>
+              <w:t xml:space="preserve">Bornera de 4 vías</w:t>
             </w:r>
           </w:p>
         </w:tc>
@@ -2927,7 +2927,7 @@
                 <w:sz w:val="19"/>
                 <w:szCs w:val="19"/>
               </w:rPr>
-              <w:t xml:space="preserve">A medida</w:t>
+              <w:t xml:space="preserve">8</w:t>
             </w:r>
           </w:p>
         </w:tc>
@@ -2960,7 +2960,7 @@
                 <w:sz w:val="19"/>
                 <w:szCs w:val="19"/>
               </w:rPr>
-              <w:t xml:space="preserve">Conexiones del lado del telar</w:t>
+              <w:t xml:space="preserve">Por canal: una para el conector del lector en la plaqueta y otra para dejar aislados y rotulados los 4 cables del lector</w:t>
             </w:r>
           </w:p>
         </w:tc>
@@ -2989,6 +2989,216 @@
           </w:tcPr>
           <w:p>
             <w:pPr>
+              <w:keepNext/>
+              <w:keepLines/>
+              <w:spacing w:after="0" w:line="260"/>
+            </w:pPr>
+            <w:r>
+              <w:rPr>
+                <w:rFonts w:ascii="IBM Plex Sans" w:cs="IBM Plex Sans" w:eastAsia="IBM Plex Sans" w:hAnsi="IBM Plex Sans"/>
+                <w:sz w:val="19"/>
+                <w:szCs w:val="19"/>
+              </w:rPr>
+              <w:t xml:space="preserve">LED, resistencia y pila</w:t>
+            </w:r>
+          </w:p>
+        </w:tc>
+        <w:tc>
+          <w:tcPr>
+            <w:tcW w:type="dxa" w:w="1500"/>
+            <w:tcBorders>
+              <w:top w:val="single" w:color="CDD8E0" w:sz="4"/>
+              <w:left w:val="single" w:color="CDD8E0" w:sz="4"/>
+              <w:bottom w:val="single" w:color="CDD8E0" w:sz="4"/>
+              <w:right w:val="single" w:color="CDD8E0" w:sz="4"/>
+            </w:tcBorders>
+            <w:shd w:fill="EDF1F5" w:color="auto" w:val="clear"/>
+            <w:tcMar>
+              <w:top w:type="dxa" w:w="70"/>
+              <w:left w:type="dxa" w:w="110"/>
+              <w:bottom w:type="dxa" w:w="70"/>
+              <w:right w:type="dxa" w:w="110"/>
+            </w:tcMar>
+          </w:tcPr>
+          <w:p>
+            <w:pPr>
+              <w:keepNext/>
+              <w:keepLines/>
+              <w:spacing w:after="0" w:line="260"/>
+            </w:pPr>
+            <w:r>
+              <w:rPr>
+                <w:rFonts w:ascii="IBM Plex Sans" w:cs="IBM Plex Sans" w:eastAsia="IBM Plex Sans" w:hAnsi="IBM Plex Sans"/>
+                <w:sz w:val="19"/>
+                <w:szCs w:val="19"/>
+              </w:rPr>
+              <w:t xml:space="preserve">1 de cada</w:t>
+            </w:r>
+          </w:p>
+        </w:tc>
+        <w:tc>
+          <w:tcPr>
+            <w:tcW w:type="dxa" w:w="4838"/>
+            <w:tcBorders>
+              <w:top w:val="single" w:color="CDD8E0" w:sz="4"/>
+              <w:left w:val="single" w:color="CDD8E0" w:sz="4"/>
+              <w:bottom w:val="single" w:color="CDD8E0" w:sz="4"/>
+              <w:right w:val="single" w:color="CDD8E0" w:sz="4"/>
+            </w:tcBorders>
+            <w:shd w:fill="EDF1F5" w:color="auto" w:val="clear"/>
+            <w:tcMar>
+              <w:top w:type="dxa" w:w="70"/>
+              <w:left w:type="dxa" w:w="110"/>
+              <w:bottom w:type="dxa" w:w="70"/>
+              <w:right w:type="dxa" w:w="110"/>
+            </w:tcMar>
+          </w:tcPr>
+          <w:p>
+            <w:pPr>
+              <w:keepNext/>
+              <w:keepLines/>
+              <w:spacing w:after="0" w:line="260"/>
+            </w:pPr>
+            <w:r>
+              <w:rPr>
+                <w:rFonts w:ascii="IBM Plex Sans" w:cs="IBM Plex Sans" w:eastAsia="IBM Plex Sans" w:hAnsi="IBM Plex Sans"/>
+                <w:sz w:val="19"/>
+                <w:szCs w:val="19"/>
+              </w:rPr>
+              <w:t xml:space="preserve">Prueba en la mesa con el firmware (sección 6). Con pila de 9 V, resistencia de 680 Ω; con dos pilas AA, de 100 Ω</w:t>
+            </w:r>
+          </w:p>
+        </w:tc>
+      </w:tr>
+      <w:tr>
+        <w:trPr>
+          <w:cantSplit/>
+          <w:tblHeader w:val="off"/>
+        </w:trPr>
+        <w:tc>
+          <w:tcPr>
+            <w:tcW w:type="dxa" w:w="3300"/>
+            <w:tcBorders>
+              <w:top w:val="single" w:color="CDD8E0" w:sz="4"/>
+              <w:left w:val="single" w:color="CDD8E0" w:sz="4"/>
+              <w:bottom w:val="single" w:color="CDD8E0" w:sz="4"/>
+              <w:right w:val="single" w:color="CDD8E0" w:sz="4"/>
+            </w:tcBorders>
+            <w:shd w:fill="FFFFFF" w:color="auto" w:val="clear"/>
+            <w:tcMar>
+              <w:top w:type="dxa" w:w="70"/>
+              <w:left w:type="dxa" w:w="110"/>
+              <w:bottom w:type="dxa" w:w="70"/>
+              <w:right w:type="dxa" w:w="110"/>
+            </w:tcMar>
+          </w:tcPr>
+          <w:p>
+            <w:pPr>
+              <w:keepNext/>
+              <w:keepLines/>
+              <w:spacing w:after="0" w:line="260"/>
+            </w:pPr>
+            <w:r>
+              <w:rPr>
+                <w:rFonts w:ascii="IBM Plex Sans" w:cs="IBM Plex Sans" w:eastAsia="IBM Plex Sans" w:hAnsi="IBM Plex Sans"/>
+                <w:sz w:val="19"/>
+                <w:szCs w:val="19"/>
+              </w:rPr>
+              <w:t xml:space="preserve">Cable, cinta para marcar y termocontraíble</w:t>
+            </w:r>
+          </w:p>
+        </w:tc>
+        <w:tc>
+          <w:tcPr>
+            <w:tcW w:type="dxa" w:w="1500"/>
+            <w:tcBorders>
+              <w:top w:val="single" w:color="CDD8E0" w:sz="4"/>
+              <w:left w:val="single" w:color="CDD8E0" w:sz="4"/>
+              <w:bottom w:val="single" w:color="CDD8E0" w:sz="4"/>
+              <w:right w:val="single" w:color="CDD8E0" w:sz="4"/>
+            </w:tcBorders>
+            <w:shd w:fill="FFFFFF" w:color="auto" w:val="clear"/>
+            <w:tcMar>
+              <w:top w:type="dxa" w:w="70"/>
+              <w:left w:type="dxa" w:w="110"/>
+              <w:bottom w:type="dxa" w:w="70"/>
+              <w:right w:type="dxa" w:w="110"/>
+            </w:tcMar>
+          </w:tcPr>
+          <w:p>
+            <w:pPr>
+              <w:keepNext/>
+              <w:keepLines/>
+              <w:spacing w:after="0" w:line="260"/>
+            </w:pPr>
+            <w:r>
+              <w:rPr>
+                <w:rFonts w:ascii="IBM Plex Sans" w:cs="IBM Plex Sans" w:eastAsia="IBM Plex Sans" w:hAnsi="IBM Plex Sans"/>
+                <w:sz w:val="19"/>
+                <w:szCs w:val="19"/>
+              </w:rPr>
+              <w:t xml:space="preserve">A medida</w:t>
+            </w:r>
+          </w:p>
+        </w:tc>
+        <w:tc>
+          <w:tcPr>
+            <w:tcW w:type="dxa" w:w="4838"/>
+            <w:tcBorders>
+              <w:top w:val="single" w:color="CDD8E0" w:sz="4"/>
+              <w:left w:val="single" w:color="CDD8E0" w:sz="4"/>
+              <w:bottom w:val="single" w:color="CDD8E0" w:sz="4"/>
+              <w:right w:val="single" w:color="CDD8E0" w:sz="4"/>
+            </w:tcBorders>
+            <w:shd w:fill="FFFFFF" w:color="auto" w:val="clear"/>
+            <w:tcMar>
+              <w:top w:type="dxa" w:w="70"/>
+              <w:left w:type="dxa" w:w="110"/>
+              <w:bottom w:type="dxa" w:w="70"/>
+              <w:right w:type="dxa" w:w="110"/>
+            </w:tcMar>
+          </w:tcPr>
+          <w:p>
+            <w:pPr>
+              <w:keepNext/>
+              <w:keepLines/>
+              <w:spacing w:after="0" w:line="260"/>
+            </w:pPr>
+            <w:r>
+              <w:rPr>
+                <w:rFonts w:ascii="IBM Plex Sans" w:cs="IBM Plex Sans" w:eastAsia="IBM Plex Sans" w:hAnsi="IBM Plex Sans"/>
+                <w:sz w:val="19"/>
+                <w:szCs w:val="19"/>
+              </w:rPr>
+              <w:t xml:space="preserve">Conexiones del lado del telar</w:t>
+            </w:r>
+          </w:p>
+        </w:tc>
+      </w:tr>
+      <w:tr>
+        <w:trPr>
+          <w:cantSplit/>
+          <w:tblHeader w:val="off"/>
+        </w:trPr>
+        <w:tc>
+          <w:tcPr>
+            <w:tcW w:type="dxa" w:w="3300"/>
+            <w:tcBorders>
+              <w:top w:val="single" w:color="CDD8E0" w:sz="4"/>
+              <w:left w:val="single" w:color="CDD8E0" w:sz="4"/>
+              <w:bottom w:val="single" w:color="CDD8E0" w:sz="4"/>
+              <w:right w:val="single" w:color="CDD8E0" w:sz="4"/>
+            </w:tcBorders>
+            <w:shd w:fill="EDF1F5" w:color="auto" w:val="clear"/>
+            <w:tcMar>
+              <w:top w:type="dxa" w:w="70"/>
+              <w:left w:type="dxa" w:w="110"/>
+              <w:bottom w:type="dxa" w:w="70"/>
+              <w:right w:type="dxa" w:w="110"/>
+            </w:tcMar>
+          </w:tcPr>
+          <w:p>
+            <w:pPr>
               <w:keepNext w:val="false"/>
               <w:keepLines/>
               <w:spacing w:after="0" w:line="260"/>
@@ -3115,15 +3325,7 @@
           <w:sz w:val="21"/>
           <w:szCs w:val="21"/>
         </w:rPr>
-        <w:t xml:space="preserve">Medir un lector óptico</w:t>
-      </w:r>
-      <w:r>
-        <w:rPr>
-          <w:rFonts w:ascii="IBM Plex Sans" w:cs="IBM Plex Sans" w:eastAsia="IBM Plex Sans" w:hAnsi="IBM Plex Sans"/>
-          <w:sz w:val="21"/>
-          <w:szCs w:val="21"/>
-        </w:rPr>
-        <w:t xml:space="preserve"> en la máquina (sección 5). Decide si el relé va en paralelo o en serie.</w:t>
+        <w:t xml:space="preserve">Medir un lector óptico en la máquina (sección 5). Confirma la conexión final: con agujero, la señal del lector va a +V.</w:t>
       </w:r>
     </w:p>
     <w:p>
@@ -3199,15 +3401,7 @@
           <w:sz w:val="21"/>
           <w:szCs w:val="21"/>
         </w:rPr>
-        <w:t xml:space="preserve">Conectarlo a un lector</w:t>
-      </w:r>
-      <w:r>
-        <w:rPr>
-          <w:rFonts w:ascii="IBM Plex Sans" w:cs="IBM Plex Sans" w:eastAsia="IBM Plex Sans" w:hAnsi="IBM Plex Sans"/>
-          <w:sz w:val="21"/>
-          <w:szCs w:val="21"/>
-        </w:rPr>
-        <w:t xml:space="preserve"> con el telar apagado (sección 8) y ajustar la configuración del firmware.</w:t>
+        <w:t xml:space="preserve">Conectarlo en el lugar de un lector, con el telar apagado (sección 8), y revisar la configuración del firmware.</w:t>
       </w:r>
     </w:p>
     <w:p>
@@ -3399,25 +3593,7 @@
           <w:sz w:val="21"/>
           <w:szCs w:val="21"/>
         </w:rPr>
-        <w:t xml:space="preserve">Antes de cortar un cable (caso en serie), </w:t>
-      </w:r>
-      <w:r>
-        <w:rPr>
-          <w:rFonts w:ascii="IBM Plex Sans" w:cs="IBM Plex Sans" w:eastAsia="IBM Plex Sans" w:hAnsi="IBM Plex Sans"/>
-          <w:b/>
-          <w:bCs/>
-          <w:sz w:val="21"/>
-          <w:szCs w:val="21"/>
-        </w:rPr>
-        <w:t xml:space="preserve">marcalo con cinta</w:t>
-      </w:r>
-      <w:r>
-        <w:rPr>
-          <w:rFonts w:ascii="IBM Plex Sans" w:cs="IBM Plex Sans" w:eastAsia="IBM Plex Sans" w:hAnsi="IBM Plex Sans"/>
-          <w:sz w:val="21"/>
-          <w:szCs w:val="21"/>
-        </w:rPr>
-        <w:t xml:space="preserve"> de los dos lados. Así se puede volver al estado original.</w:t>
+        <w:t xml:space="preserve">Antes de desconectar los cables de un lector, marcalos con cinta en las dos puntas y aislalos en su bornera. Así se puede volver al estado original.</w:t>
       </w:r>
     </w:p>
     <w:p>
@@ -3571,25 +3747,7 @@
           <w:sz w:val="21"/>
           <w:szCs w:val="21"/>
         </w:rPr>
-        <w:t xml:space="preserve">No superes 120 mA en la salida. Por eso el relé va en el circuito del lector, </w:t>
-      </w:r>
-      <w:r>
-        <w:rPr>
-          <w:rFonts w:ascii="IBM Plex Sans" w:cs="IBM Plex Sans" w:eastAsia="IBM Plex Sans" w:hAnsi="IBM Plex Sans"/>
-          <w:b/>
-          <w:bCs/>
-          <w:sz w:val="21"/>
-          <w:szCs w:val="21"/>
-        </w:rPr>
-        <w:t xml:space="preserve">nunca en la alimentación de las bobinas</w:t>
-      </w:r>
-      <w:r>
-        <w:rPr>
-          <w:rFonts w:ascii="IBM Plex Sans" w:cs="IBM Plex Sans" w:eastAsia="IBM Plex Sans" w:hAnsi="IBM Plex Sans"/>
-          <w:sz w:val="21"/>
-          <w:szCs w:val="21"/>
-        </w:rPr>
-        <w:t xml:space="preserve">.</w:t>
+        <w:t xml:space="preserve">No superes 120 mA en la salida. Por eso el relé va en el circuito del lector, nunca en la alimentación de las bobinas, y lleva en serie una resistencia de protección que limita la corriente aun con un error de cableado.</w:t>
       </w:r>
     </w:p>
     <w:p>
@@ -3611,7 +3769,7 @@
           <w:sz w:val="21"/>
           <w:szCs w:val="21"/>
         </w:rPr>
-        <w:t xml:space="preserve">Se hacen sobre un lector óptico, con el telar encendido y en marcha lenta. Anotá cada resultado: el paso 8 depende de ellos.</w:t>
+        <w:t xml:space="preserve">Se hacen sobre un lector óptico, con el telar encendido pero sin tejer: la cinta se mueve a mano, o se pone un papel delante del lector. Anotá cada resultado: la sección 8 depende de ellos.</w:t>
       </w:r>
     </w:p>
     <w:tbl>
@@ -3816,7 +3974,7 @@
                 <w:sz w:val="19"/>
                 <w:szCs w:val="19"/>
               </w:rPr>
-              <w:t xml:space="preserve">Tensión en la salida del lector</w:t>
+              <w:t xml:space="preserve">Alimentación del lector</w:t>
             </w:r>
           </w:p>
         </w:tc>
@@ -3849,7 +4007,7 @@
                 <w:sz w:val="19"/>
                 <w:szCs w:val="19"/>
               </w:rPr>
-              <w:t xml:space="preserve">Multímetro en continua y en alterna entre los dos cables de salida</w:t>
+              <w:t xml:space="preserve">Multímetro en continua entre el + y el − de su conector</w:t>
             </w:r>
           </w:p>
         </w:tc>
@@ -3882,7 +4040,7 @@
                 <w:sz w:val="19"/>
                 <w:szCs w:val="19"/>
               </w:rPr>
-              <w:t xml:space="preserve">Menos de 24 V</w:t>
+              <w:t xml:space="preserve">Menos de 30 V</w:t>
             </w:r>
           </w:p>
         </w:tc>
@@ -3915,7 +4073,7 @@
                 <w:sz w:val="19"/>
                 <w:szCs w:val="19"/>
               </w:rPr>
-              <w:t xml:space="preserve">Que el relé la soporta (hasta 350 V)</w:t>
+              <w:t xml:space="preserve">La resistencia de protección: 220 Ω 1 W hasta 15 V, 470 Ω 2 W de 15 a 30 V</w:t>
             </w:r>
           </w:p>
         </w:tc>
@@ -3987,7 +4145,7 @@
                 <w:sz w:val="19"/>
                 <w:szCs w:val="19"/>
               </w:rPr>
-              <w:t xml:space="preserve">Medir con papel tapando y con un agujero frente al lector</w:t>
+              <w:t xml:space="preserve">Señal contra el −, con papel delante del lector y con un agujero</w:t>
             </w:r>
           </w:p>
         </w:tc>
@@ -4020,7 +4178,7 @@
                 <w:sz w:val="19"/>
                 <w:szCs w:val="19"/>
               </w:rPr>
-              <w:t xml:space="preserve">Cambia entre dos valores</w:t>
+              <w:t xml:space="preserve">Papel: unos 0 V · agujero: cerca de +V</w:t>
             </w:r>
           </w:p>
         </w:tc>
@@ -4053,7 +4211,7 @@
                 <w:sz w:val="19"/>
                 <w:szCs w:val="19"/>
               </w:rPr>
-              <w:t xml:space="preserve">Paralelo o serie (sección 8)</w:t>
+              <w:t xml:space="preserve">Que es la conexión final, caso 2A (sección 8)</w:t>
             </w:r>
           </w:p>
         </w:tc>
@@ -4092,7 +4250,7 @@
                 <w:sz w:val="19"/>
                 <w:szCs w:val="19"/>
               </w:rPr>
-              <w:t xml:space="preserve">Corriente del circuito</w:t>
+              <w:t xml:space="preserve">Corriente con el relé cerrado</w:t>
             </w:r>
           </w:p>
         </w:tc>
@@ -4125,7 +4283,7 @@
                 <w:sz w:val="19"/>
                 <w:szCs w:val="19"/>
               </w:rPr>
-              <w:t xml:space="preserve">Multímetro en mA intercalado en un cable, con el agujero presente</w:t>
+              <w:t xml:space="preserve">Lector desconectado y la 10 kΩ ½ W puesta: multímetro en mA en serie con la resistencia de protección, en el lugar del relé</w:t>
             </w:r>
           </w:p>
         </w:tc>
@@ -4158,7 +4316,7 @@
                 <w:sz w:val="19"/>
                 <w:szCs w:val="19"/>
               </w:rPr>
-              <w:t xml:space="preserve">De 5 a 20 mA</w:t>
+              <w:t xml:space="preserve">Menos de 20 mA</w:t>
             </w:r>
           </w:p>
         </w:tc>
@@ -4389,15 +4547,7 @@
                 <w:sz w:val="21"/>
                 <w:szCs w:val="21"/>
               </w:rPr>
-              <w:t xml:space="preserve">Cuidado al medir corriente. </w:t>
-            </w:r>
-            <w:r>
-              <w:rPr>
-                <w:rFonts w:ascii="IBM Plex Sans" w:cs="IBM Plex Sans" w:eastAsia="IBM Plex Sans" w:hAnsi="IBM Plex Sans"/>
-                <w:sz w:val="20"/>
-                <w:szCs w:val="20"/>
-              </w:rPr>
-              <w:t xml:space="preserve">El multímetro en mA se intercala en el cable, nunca se conecta entre los dos cables: así haría un cortocircuito. Si la corriente medida superara los 100 mA, no sigas: consultá antes de conectar el relé.</w:t>
+              <w:t xml:space="preserve">Cuidado al medir corriente. El multímetro en mA nunca se conecta directo entre el + y el −: así haría un cortocircuito. Va siempre en serie con la resistencia de protección, en el lugar del relé. Si la corriente medida superara los 100 mA, no sigas: consultá antes de conectar el relé.</w:t>
             </w:r>
           </w:p>
         </w:tc>
@@ -5608,7 +5758,7 @@
       <w:r>
         <w:drawing>
           <wp:inline distT="0" distB="0" distL="0" distR="0">
-            <wp:extent cx="5715000" cy="3733800"/>
+            <wp:extent cx="5715000" cy="4637314"/>
             <wp:effectExtent t="0" r="0" b="0" l="0"/>
             <wp:docPr id="2" name="Un canal completo: lado del ESP32, relé y lado del telar, con los casos en paralelo y en serie." descr="Un canal completo: lado del ESP32, relé y lado del telar, con los casos en paralelo y en serie." title="Un canal completo: lado del ESP32, relé y lado del telar, con los casos en paralelo y en serie."/>
             <wp:cNvGraphicFramePr>
@@ -5633,7 +5783,7 @@
                   <pic:spPr bwMode="auto">
                     <a:xfrm>
                       <a:off x="0" y="0"/>
-                      <a:ext cx="5715000" cy="3733800"/>
+                      <a:ext cx="5715000" cy="4637314"/>
                     </a:xfrm>
                     <a:prstGeom prst="rect">
                       <a:avLst/>
@@ -5660,7 +5810,7 @@
           <w:sz w:val="18"/>
           <w:szCs w:val="18"/>
         </w:rPr>
-        <w:t xml:space="preserve">Un canal completo: lado del ESP32, relé y lado del telar, con los casos en paralelo y en serie.</w:t>
+        <w:t xml:space="preserve">La conexión final de un canal: lado del ESP32, relé y lado del telar, con el relé en el lugar del lector y la resistencia de protección.</w:t>
       </w:r>
     </w:p>
     <w:p>
@@ -5794,579 +5944,74 @@
           <w:sz w:val="21"/>
           <w:szCs w:val="21"/>
         </w:rPr>
-        <w:t xml:space="preserve">Con el telar </w:t>
-      </w:r>
-      <w:r>
-        <w:rPr>
-          <w:rFonts w:ascii="IBM Plex Sans" w:cs="IBM Plex Sans" w:eastAsia="IBM Plex Sans" w:hAnsi="IBM Plex Sans"/>
-          <w:b/>
-          <w:bCs/>
-          <w:sz w:val="21"/>
-          <w:szCs w:val="21"/>
-        </w:rPr>
-        <w:t xml:space="preserve">apagado</w:t>
-      </w:r>
-      <w:r>
-        <w:rPr>
-          <w:rFonts w:ascii="IBM Plex Sans" w:cs="IBM Plex Sans" w:eastAsia="IBM Plex Sans" w:hAnsi="IBM Plex Sans"/>
-          <w:sz w:val="21"/>
-          <w:szCs w:val="21"/>
-        </w:rPr>
-        <w:t xml:space="preserve">. Las patas 4 y 6 no tienen polaridad: da igual cuál va a cada lado. Cómo se conectan depende de la medición de la sección 5:</w:t>
-      </w:r>
-    </w:p>
-    <w:tbl>
-      <w:tblPr>
-        <w:tblW w:type="dxa" w:w="9638"/>
-        <w:tblBorders>
-          <w:top w:val="single" w:color="auto" w:sz="4"/>
-          <w:left w:val="single" w:color="auto" w:sz="4"/>
-          <w:bottom w:val="single" w:color="auto" w:sz="4"/>
-          <w:right w:val="single" w:color="auto" w:sz="4"/>
-          <w:insideH w:val="single" w:color="auto" w:sz="4"/>
-          <w:insideV w:val="single" w:color="auto" w:sz="4"/>
-        </w:tblBorders>
-      </w:tblPr>
-      <w:tblGrid>
-        <w:gridCol w:w="2000"/>
-        <w:gridCol w:w="3819"/>
-        <w:gridCol w:w="3819"/>
-      </w:tblGrid>
-      <w:tr>
-        <w:trPr>
-          <w:cantSplit/>
-          <w:tblHeader/>
-        </w:trPr>
-        <w:tc>
-          <w:tcPr>
-            <w:tcW w:type="dxa" w:w="2000"/>
-            <w:tcBorders>
-              <w:top w:val="single" w:color="CDD8E0" w:sz="4"/>
-              <w:left w:val="single" w:color="CDD8E0" w:sz="4"/>
-              <w:bottom w:val="single" w:color="CDD8E0" w:sz="4"/>
-              <w:right w:val="single" w:color="CDD8E0" w:sz="4"/>
-            </w:tcBorders>
-            <w:shd w:fill="1E3A5F" w:color="auto" w:val="clear"/>
-            <w:tcMar>
-              <w:top w:type="dxa" w:w="70"/>
-              <w:left w:type="dxa" w:w="110"/>
-              <w:bottom w:type="dxa" w:w="70"/>
-              <w:right w:type="dxa" w:w="110"/>
-            </w:tcMar>
-          </w:tcPr>
-          <w:p>
-            <w:pPr>
-              <w:keepNext/>
-              <w:keepLines/>
-              <w:spacing w:after="0" w:line="260"/>
-            </w:pPr>
-            <w:r>
-              <w:rPr>
-                <w:rFonts w:ascii="IBM Plex Sans" w:cs="IBM Plex Sans" w:eastAsia="IBM Plex Sans" w:hAnsi="IBM Plex Sans"/>
-                <w:b/>
-                <w:bCs/>
-                <w:color w:val="FFFFFF"/>
-                <w:sz w:val="19"/>
-                <w:szCs w:val="19"/>
-              </w:rPr>
-              <w:t xml:space="preserve"/>
-            </w:r>
-          </w:p>
-        </w:tc>
-        <w:tc>
-          <w:tcPr>
-            <w:tcW w:type="dxa" w:w="3819"/>
-            <w:tcBorders>
-              <w:top w:val="single" w:color="CDD8E0" w:sz="4"/>
-              <w:left w:val="single" w:color="CDD8E0" w:sz="4"/>
-              <w:bottom w:val="single" w:color="CDD8E0" w:sz="4"/>
-              <w:right w:val="single" w:color="CDD8E0" w:sz="4"/>
-            </w:tcBorders>
-            <w:shd w:fill="1E3A5F" w:color="auto" w:val="clear"/>
-            <w:tcMar>
-              <w:top w:type="dxa" w:w="70"/>
-              <w:left w:type="dxa" w:w="110"/>
-              <w:bottom w:type="dxa" w:w="70"/>
-              <w:right w:type="dxa" w:w="110"/>
-            </w:tcMar>
-          </w:tcPr>
-          <w:p>
-            <w:pPr>
-              <w:keepNext/>
-              <w:keepLines/>
-              <w:spacing w:after="0" w:line="260"/>
-            </w:pPr>
-            <w:r>
-              <w:rPr>
-                <w:rFonts w:ascii="IBM Plex Sans" w:cs="IBM Plex Sans" w:eastAsia="IBM Plex Sans" w:hAnsi="IBM Plex Sans"/>
-                <w:b/>
-                <w:bCs/>
-                <w:color w:val="FFFFFF"/>
-                <w:sz w:val="19"/>
-                <w:szCs w:val="19"/>
-              </w:rPr>
-              <w:t xml:space="preserve">El agujero CIERRA el circuito</w:t>
-            </w:r>
-          </w:p>
-        </w:tc>
-        <w:tc>
-          <w:tcPr>
-            <w:tcW w:type="dxa" w:w="3819"/>
-            <w:tcBorders>
-              <w:top w:val="single" w:color="CDD8E0" w:sz="4"/>
-              <w:left w:val="single" w:color="CDD8E0" w:sz="4"/>
-              <w:bottom w:val="single" w:color="CDD8E0" w:sz="4"/>
-              <w:right w:val="single" w:color="CDD8E0" w:sz="4"/>
-            </w:tcBorders>
-            <w:shd w:fill="1E3A5F" w:color="auto" w:val="clear"/>
-            <w:tcMar>
-              <w:top w:type="dxa" w:w="70"/>
-              <w:left w:type="dxa" w:w="110"/>
-              <w:bottom w:type="dxa" w:w="70"/>
-              <w:right w:type="dxa" w:w="110"/>
-            </w:tcMar>
-          </w:tcPr>
-          <w:p>
-            <w:pPr>
-              <w:keepNext/>
-              <w:keepLines/>
-              <w:spacing w:after="0" w:line="260"/>
-            </w:pPr>
-            <w:r>
-              <w:rPr>
-                <w:rFonts w:ascii="IBM Plex Sans" w:cs="IBM Plex Sans" w:eastAsia="IBM Plex Sans" w:hAnsi="IBM Plex Sans"/>
-                <w:b/>
-                <w:bCs/>
-                <w:color w:val="FFFFFF"/>
-                <w:sz w:val="19"/>
-                <w:szCs w:val="19"/>
-              </w:rPr>
-              <w:t xml:space="preserve">El agujero ABRE el circuito</w:t>
-            </w:r>
-          </w:p>
-        </w:tc>
-      </w:tr>
-      <w:tr>
-        <w:trPr>
-          <w:cantSplit/>
-          <w:tblHeader w:val="off"/>
-        </w:trPr>
-        <w:tc>
-          <w:tcPr>
-            <w:tcW w:type="dxa" w:w="2000"/>
-            <w:tcBorders>
-              <w:top w:val="single" w:color="CDD8E0" w:sz="4"/>
-              <w:left w:val="single" w:color="CDD8E0" w:sz="4"/>
-              <w:bottom w:val="single" w:color="CDD8E0" w:sz="4"/>
-              <w:right w:val="single" w:color="CDD8E0" w:sz="4"/>
-            </w:tcBorders>
-            <w:shd w:fill="FFFFFF" w:color="auto" w:val="clear"/>
-            <w:tcMar>
-              <w:top w:type="dxa" w:w="70"/>
-              <w:left w:type="dxa" w:w="110"/>
-              <w:bottom w:type="dxa" w:w="70"/>
-              <w:right w:type="dxa" w:w="110"/>
-            </w:tcMar>
-          </w:tcPr>
-          <w:p>
-            <w:pPr>
-              <w:keepNext/>
-              <w:keepLines/>
-              <w:spacing w:after="0" w:line="260"/>
-            </w:pPr>
-            <w:r>
-              <w:rPr>
-                <w:rFonts w:ascii="IBM Plex Sans" w:cs="IBM Plex Sans" w:eastAsia="IBM Plex Sans" w:hAnsi="IBM Plex Sans"/>
-                <w:sz w:val="19"/>
-                <w:szCs w:val="19"/>
-              </w:rPr>
-              <w:t xml:space="preserve">Cómo va el relé</w:t>
-            </w:r>
-          </w:p>
-        </w:tc>
-        <w:tc>
-          <w:tcPr>
-            <w:tcW w:type="dxa" w:w="3819"/>
-            <w:tcBorders>
-              <w:top w:val="single" w:color="CDD8E0" w:sz="4"/>
-              <w:left w:val="single" w:color="CDD8E0" w:sz="4"/>
-              <w:bottom w:val="single" w:color="CDD8E0" w:sz="4"/>
-              <w:right w:val="single" w:color="CDD8E0" w:sz="4"/>
-            </w:tcBorders>
-            <w:shd w:fill="FFFFFF" w:color="auto" w:val="clear"/>
-            <w:tcMar>
-              <w:top w:type="dxa" w:w="70"/>
-              <w:left w:type="dxa" w:w="110"/>
-              <w:bottom w:type="dxa" w:w="70"/>
-              <w:right w:type="dxa" w:w="110"/>
-            </w:tcMar>
-          </w:tcPr>
-          <w:p>
-            <w:pPr>
-              <w:keepNext/>
-              <w:keepLines/>
-              <w:spacing w:after="0" w:line="260"/>
-            </w:pPr>
-            <w:r>
-              <w:rPr>
-                <w:rFonts w:ascii="IBM Plex Sans" w:cs="IBM Plex Sans" w:eastAsia="IBM Plex Sans" w:hAnsi="IBM Plex Sans"/>
-                <w:sz w:val="19"/>
-                <w:szCs w:val="19"/>
-              </w:rPr>
-              <w:t xml:space="preserve">En paralelo con el lector</w:t>
-            </w:r>
-          </w:p>
-        </w:tc>
-        <w:tc>
-          <w:tcPr>
-            <w:tcW w:type="dxa" w:w="3819"/>
-            <w:tcBorders>
-              <w:top w:val="single" w:color="CDD8E0" w:sz="4"/>
-              <w:left w:val="single" w:color="CDD8E0" w:sz="4"/>
-              <w:bottom w:val="single" w:color="CDD8E0" w:sz="4"/>
-              <w:right w:val="single" w:color="CDD8E0" w:sz="4"/>
-            </w:tcBorders>
-            <w:shd w:fill="FFFFFF" w:color="auto" w:val="clear"/>
-            <w:tcMar>
-              <w:top w:type="dxa" w:w="70"/>
-              <w:left w:type="dxa" w:w="110"/>
-              <w:bottom w:type="dxa" w:w="70"/>
-              <w:right w:type="dxa" w:w="110"/>
-            </w:tcMar>
-          </w:tcPr>
-          <w:p>
-            <w:pPr>
-              <w:keepNext/>
-              <w:keepLines/>
-              <w:spacing w:after="0" w:line="260"/>
-            </w:pPr>
-            <w:r>
-              <w:rPr>
-                <w:rFonts w:ascii="IBM Plex Sans" w:cs="IBM Plex Sans" w:eastAsia="IBM Plex Sans" w:hAnsi="IBM Plex Sans"/>
-                <w:sz w:val="19"/>
-                <w:szCs w:val="19"/>
-              </w:rPr>
-              <w:t xml:space="preserve">En serie, intercalado en un cable</w:t>
-            </w:r>
-          </w:p>
-        </w:tc>
-      </w:tr>
-      <w:tr>
-        <w:trPr>
-          <w:cantSplit/>
-          <w:tblHeader w:val="off"/>
-        </w:trPr>
-        <w:tc>
-          <w:tcPr>
-            <w:tcW w:type="dxa" w:w="2000"/>
-            <w:tcBorders>
-              <w:top w:val="single" w:color="CDD8E0" w:sz="4"/>
-              <w:left w:val="single" w:color="CDD8E0" w:sz="4"/>
-              <w:bottom w:val="single" w:color="CDD8E0" w:sz="4"/>
-              <w:right w:val="single" w:color="CDD8E0" w:sz="4"/>
-            </w:tcBorders>
-            <w:shd w:fill="EDF1F5" w:color="auto" w:val="clear"/>
-            <w:tcMar>
-              <w:top w:type="dxa" w:w="70"/>
-              <w:left w:type="dxa" w:w="110"/>
-              <w:bottom w:type="dxa" w:w="70"/>
-              <w:right w:type="dxa" w:w="110"/>
-            </w:tcMar>
-          </w:tcPr>
-          <w:p>
-            <w:pPr>
-              <w:keepNext/>
-              <w:keepLines/>
-              <w:spacing w:after="0" w:line="260"/>
-            </w:pPr>
-            <w:r>
-              <w:rPr>
-                <w:rFonts w:ascii="IBM Plex Sans" w:cs="IBM Plex Sans" w:eastAsia="IBM Plex Sans" w:hAnsi="IBM Plex Sans"/>
-                <w:sz w:val="19"/>
-                <w:szCs w:val="19"/>
-              </w:rPr>
-              <w:t xml:space="preserve">Conexión</w:t>
-            </w:r>
-          </w:p>
-        </w:tc>
-        <w:tc>
-          <w:tcPr>
-            <w:tcW w:type="dxa" w:w="3819"/>
-            <w:tcBorders>
-              <w:top w:val="single" w:color="CDD8E0" w:sz="4"/>
-              <w:left w:val="single" w:color="CDD8E0" w:sz="4"/>
-              <w:bottom w:val="single" w:color="CDD8E0" w:sz="4"/>
-              <w:right w:val="single" w:color="CDD8E0" w:sz="4"/>
-            </w:tcBorders>
-            <w:shd w:fill="EDF1F5" w:color="auto" w:val="clear"/>
-            <w:tcMar>
-              <w:top w:type="dxa" w:w="70"/>
-              <w:left w:type="dxa" w:w="110"/>
-              <w:bottom w:type="dxa" w:w="70"/>
-              <w:right w:type="dxa" w:w="110"/>
-            </w:tcMar>
-          </w:tcPr>
-          <w:p>
-            <w:pPr>
-              <w:keepNext/>
-              <w:keepLines/>
-              <w:spacing w:after="0" w:line="260"/>
-            </w:pPr>
-            <w:r>
-              <w:rPr>
-                <w:rFonts w:ascii="IBM Plex Sans" w:cs="IBM Plex Sans" w:eastAsia="IBM Plex Sans" w:hAnsi="IBM Plex Sans"/>
-                <w:sz w:val="19"/>
-                <w:szCs w:val="19"/>
-              </w:rPr>
-              <w:t xml:space="preserve">Patas 4 y 6 a los dos cables de salida del lector, sin cortar nada</w:t>
-            </w:r>
-          </w:p>
-        </w:tc>
-        <w:tc>
-          <w:tcPr>
-            <w:tcW w:type="dxa" w:w="3819"/>
-            <w:tcBorders>
-              <w:top w:val="single" w:color="CDD8E0" w:sz="4"/>
-              <w:left w:val="single" w:color="CDD8E0" w:sz="4"/>
-              <w:bottom w:val="single" w:color="CDD8E0" w:sz="4"/>
-              <w:right w:val="single" w:color="CDD8E0" w:sz="4"/>
-            </w:tcBorders>
-            <w:shd w:fill="EDF1F5" w:color="auto" w:val="clear"/>
-            <w:tcMar>
-              <w:top w:type="dxa" w:w="70"/>
-              <w:left w:type="dxa" w:w="110"/>
-              <w:bottom w:type="dxa" w:w="70"/>
-              <w:right w:type="dxa" w:w="110"/>
-            </w:tcMar>
-          </w:tcPr>
-          <w:p>
-            <w:pPr>
-              <w:keepNext/>
-              <w:keepLines/>
-              <w:spacing w:after="0" w:line="260"/>
-            </w:pPr>
-            <w:r>
-              <w:rPr>
-                <w:rFonts w:ascii="IBM Plex Sans" w:cs="IBM Plex Sans" w:eastAsia="IBM Plex Sans" w:hAnsi="IBM Plex Sans"/>
-                <w:sz w:val="19"/>
-                <w:szCs w:val="19"/>
-              </w:rPr>
-              <w:t xml:space="preserve">Marcar un cable, cortarlo y conectar la pata 4 a un extremo y la 6 al otro</w:t>
-            </w:r>
-          </w:p>
-        </w:tc>
-      </w:tr>
-      <w:tr>
-        <w:trPr>
-          <w:cantSplit/>
-          <w:tblHeader w:val="off"/>
-        </w:trPr>
-        <w:tc>
-          <w:tcPr>
-            <w:tcW w:type="dxa" w:w="2000"/>
-            <w:tcBorders>
-              <w:top w:val="single" w:color="CDD8E0" w:sz="4"/>
-              <w:left w:val="single" w:color="CDD8E0" w:sz="4"/>
-              <w:bottom w:val="single" w:color="CDD8E0" w:sz="4"/>
-              <w:right w:val="single" w:color="CDD8E0" w:sz="4"/>
-            </w:tcBorders>
-            <w:shd w:fill="FFFFFF" w:color="auto" w:val="clear"/>
-            <w:tcMar>
-              <w:top w:type="dxa" w:w="70"/>
-              <w:left w:type="dxa" w:w="110"/>
-              <w:bottom w:type="dxa" w:w="70"/>
-              <w:right w:type="dxa" w:w="110"/>
-            </w:tcMar>
-          </w:tcPr>
-          <w:p>
-            <w:pPr>
-              <w:keepNext/>
-              <w:keepLines/>
-              <w:spacing w:after="0" w:line="260"/>
-            </w:pPr>
-            <w:r>
-              <w:rPr>
-                <w:rFonts w:ascii="IBM Plex Sans" w:cs="IBM Plex Sans" w:eastAsia="IBM Plex Sans" w:hAnsi="IBM Plex Sans"/>
-                <w:sz w:val="19"/>
-                <w:szCs w:val="19"/>
-              </w:rPr>
-              <w:t xml:space="preserve">Firmware</w:t>
-            </w:r>
-          </w:p>
-        </w:tc>
-        <w:tc>
-          <w:tcPr>
-            <w:tcW w:type="dxa" w:w="3819"/>
-            <w:tcBorders>
-              <w:top w:val="single" w:color="CDD8E0" w:sz="4"/>
-              <w:left w:val="single" w:color="CDD8E0" w:sz="4"/>
-              <w:bottom w:val="single" w:color="CDD8E0" w:sz="4"/>
-              <w:right w:val="single" w:color="CDD8E0" w:sz="4"/>
-            </w:tcBorders>
-            <w:shd w:fill="FFFFFF" w:color="auto" w:val="clear"/>
-            <w:tcMar>
-              <w:top w:type="dxa" w:w="70"/>
-              <w:left w:type="dxa" w:w="110"/>
-              <w:bottom w:type="dxa" w:w="70"/>
-              <w:right w:type="dxa" w:w="110"/>
-            </w:tcMar>
-          </w:tcPr>
-          <w:p>
-            <w:pPr>
-              <w:keepNext/>
-              <w:keepLines/>
-              <w:spacing w:after="0" w:line="260"/>
-            </w:pPr>
-            <w:r>
-              <w:rPr>
-                <w:rFonts w:ascii="IBM Plex Sans" w:cs="IBM Plex Sans" w:eastAsia="IBM Plex Sans" w:hAnsi="IBM Plex Sans"/>
-                <w:sz w:val="19"/>
-                <w:szCs w:val="19"/>
-              </w:rPr>
-              <w:t xml:space="preserve">CANAL_ACTIVO_EN_ALTO = true (como viene)</w:t>
-            </w:r>
-          </w:p>
-        </w:tc>
-        <w:tc>
-          <w:tcPr>
-            <w:tcW w:type="dxa" w:w="3819"/>
-            <w:tcBorders>
-              <w:top w:val="single" w:color="CDD8E0" w:sz="4"/>
-              <w:left w:val="single" w:color="CDD8E0" w:sz="4"/>
-              <w:bottom w:val="single" w:color="CDD8E0" w:sz="4"/>
-              <w:right w:val="single" w:color="CDD8E0" w:sz="4"/>
-            </w:tcBorders>
-            <w:shd w:fill="FFFFFF" w:color="auto" w:val="clear"/>
-            <w:tcMar>
-              <w:top w:type="dxa" w:w="70"/>
-              <w:left w:type="dxa" w:w="110"/>
-              <w:bottom w:type="dxa" w:w="70"/>
-              <w:right w:type="dxa" w:w="110"/>
-            </w:tcMar>
-          </w:tcPr>
-          <w:p>
-            <w:pPr>
-              <w:keepNext/>
-              <w:keepLines/>
-              <w:spacing w:after="0" w:line="260"/>
-            </w:pPr>
-            <w:r>
-              <w:rPr>
-                <w:rFonts w:ascii="IBM Plex Sans" w:cs="IBM Plex Sans" w:eastAsia="IBM Plex Sans" w:hAnsi="IBM Plex Sans"/>
-                <w:sz w:val="19"/>
-                <w:szCs w:val="19"/>
-              </w:rPr>
-              <w:t xml:space="preserve">Cambiar a CANAL_ACTIVO_EN_ALTO = false en control_trama_esp32/config.h</w:t>
-            </w:r>
-          </w:p>
-        </w:tc>
-      </w:tr>
-      <w:tr>
-        <w:trPr>
-          <w:cantSplit/>
-          <w:tblHeader w:val="off"/>
-        </w:trPr>
-        <w:tc>
-          <w:tcPr>
-            <w:tcW w:type="dxa" w:w="2000"/>
-            <w:tcBorders>
-              <w:top w:val="single" w:color="CDD8E0" w:sz="4"/>
-              <w:left w:val="single" w:color="CDD8E0" w:sz="4"/>
-              <w:bottom w:val="single" w:color="CDD8E0" w:sz="4"/>
-              <w:right w:val="single" w:color="CDD8E0" w:sz="4"/>
-            </w:tcBorders>
-            <w:shd w:fill="EDF1F5" w:color="auto" w:val="clear"/>
-            <w:tcMar>
-              <w:top w:type="dxa" w:w="70"/>
-              <w:left w:type="dxa" w:w="110"/>
-              <w:bottom w:type="dxa" w:w="70"/>
-              <w:right w:type="dxa" w:w="110"/>
-            </w:tcMar>
-          </w:tcPr>
-          <w:p>
-            <w:pPr>
-              <w:keepNext w:val="false"/>
-              <w:keepLines/>
-              <w:spacing w:after="0" w:line="260"/>
-            </w:pPr>
-            <w:r>
-              <w:rPr>
-                <w:rFonts w:ascii="IBM Plex Sans" w:cs="IBM Plex Sans" w:eastAsia="IBM Plex Sans" w:hAnsi="IBM Plex Sans"/>
-                <w:sz w:val="19"/>
-                <w:szCs w:val="19"/>
-              </w:rPr>
-              <w:t xml:space="preserve">Con el ESP32 apagado</w:t>
-            </w:r>
-          </w:p>
-        </w:tc>
-        <w:tc>
-          <w:tcPr>
-            <w:tcW w:type="dxa" w:w="3819"/>
-            <w:tcBorders>
-              <w:top w:val="single" w:color="CDD8E0" w:sz="4"/>
-              <w:left w:val="single" w:color="CDD8E0" w:sz="4"/>
-              <w:bottom w:val="single" w:color="CDD8E0" w:sz="4"/>
-              <w:right w:val="single" w:color="CDD8E0" w:sz="4"/>
-            </w:tcBorders>
-            <w:shd w:fill="EDF1F5" w:color="auto" w:val="clear"/>
-            <w:tcMar>
-              <w:top w:type="dxa" w:w="70"/>
-              <w:left w:type="dxa" w:w="110"/>
-              <w:bottom w:type="dxa" w:w="70"/>
-              <w:right w:type="dxa" w:w="110"/>
-            </w:tcMar>
-          </w:tcPr>
-          <w:p>
-            <w:pPr>
-              <w:keepNext w:val="false"/>
-              <w:keepLines/>
-              <w:spacing w:after="0" w:line="260"/>
-            </w:pPr>
-            <w:r>
-              <w:rPr>
-                <w:rFonts w:ascii="IBM Plex Sans" w:cs="IBM Plex Sans" w:eastAsia="IBM Plex Sans" w:hAnsi="IBM Plex Sans"/>
-                <w:sz w:val="19"/>
-                <w:szCs w:val="19"/>
-              </w:rPr>
-              <w:t xml:space="preserve">Los relés quedan abiertos y manda el lector</w:t>
-            </w:r>
-          </w:p>
-        </w:tc>
-        <w:tc>
-          <w:tcPr>
-            <w:tcW w:type="dxa" w:w="3819"/>
-            <w:tcBorders>
-              <w:top w:val="single" w:color="CDD8E0" w:sz="4"/>
-              <w:left w:val="single" w:color="CDD8E0" w:sz="4"/>
-              <w:bottom w:val="single" w:color="CDD8E0" w:sz="4"/>
-              <w:right w:val="single" w:color="CDD8E0" w:sz="4"/>
-            </w:tcBorders>
-            <w:shd w:fill="EDF1F5" w:color="auto" w:val="clear"/>
-            <w:tcMar>
-              <w:top w:type="dxa" w:w="70"/>
-              <w:left w:type="dxa" w:w="110"/>
-              <w:bottom w:type="dxa" w:w="70"/>
-              <w:right w:type="dxa" w:w="110"/>
-            </w:tcMar>
-          </w:tcPr>
-          <w:p>
-            <w:pPr>
-              <w:keepNext w:val="false"/>
-              <w:keepLines/>
-              <w:spacing w:after="0" w:line="260"/>
-            </w:pPr>
-            <w:r>
-              <w:rPr>
-                <w:rFonts w:ascii="IBM Plex Sans" w:cs="IBM Plex Sans" w:eastAsia="IBM Plex Sans" w:hAnsi="IBM Plex Sans"/>
-                <w:sz w:val="19"/>
-                <w:szCs w:val="19"/>
-              </w:rPr>
-              <w:t xml:space="preserve">Los relés quedan abiertos: todos los canales se leen como agujero</w:t>
-            </w:r>
-          </w:p>
-        </w:tc>
-      </w:tr>
-    </w:tbl>
+        <w:t xml:space="preserve">Con el telar apagado y desenchufado. La conexión final, la más segura, pone el relé en el lugar del lector: con agujero el lector da la señal (+V) que activa la bobina, y ahora esa señal la da el relé cuando el ESP32 lo pide. Se hace en el conector del lector en la plaqueta, con bornera, en cada canal (diagramas/hardware/conexion_final_rele.png). Las patas 4 y 6 no tienen polaridad.</w:t>
+      </w:r>
+    </w:p>
+    <w:p>
+      <w:pPr>
+        <w:spacing w:after="120" w:line="290"/>
+      </w:pPr>
+      <w:r>
+        <w:rPr>
+          <w:rFonts w:ascii="IBM Plex Sans" w:cs="IBM Plex Sans" w:eastAsia="IBM Plex Sans" w:hAnsi="IBM Plex Sans"/>
+          <w:sz w:val="21"/>
+          <w:szCs w:val="21"/>
+        </w:rPr>
+        <w:t xml:space="preserve">1. Desconectá los 4 cables del lector de la plaqueta, marcalos en las dos puntas y aislalos en su bornera, para poder volver a conectarlo.</w:t>
+      </w:r>
+    </w:p>
+    <w:p>
+      <w:pPr>
+        <w:spacing w:after="120" w:line="290"/>
+      </w:pPr>
+      <w:r>
+        <w:rPr>
+          <w:rFonts w:ascii="IBM Plex Sans" w:cs="IBM Plex Sans" w:eastAsia="IBM Plex Sans" w:hAnsi="IBM Plex Sans"/>
+          <w:sz w:val="21"/>
+          <w:szCs w:val="21"/>
+        </w:rPr>
+        <w:t xml:space="preserve">2. Del + del conector, la resistencia de protección a la pata 4 del relé: 220 Ω 1 W si el lector se alimenta con hasta 15 V, 470 Ω 2 W de 15 a 30 V. Con más de 30 V, consultá.</w:t>
+      </w:r>
+    </w:p>
+    <w:p>
+      <w:pPr>
+        <w:spacing w:after="120" w:line="290"/>
+      </w:pPr>
+      <w:r>
+        <w:rPr>
+          <w:rFonts w:ascii="IBM Plex Sans" w:cs="IBM Plex Sans" w:eastAsia="IBM Plex Sans" w:hAnsi="IBM Plex Sans"/>
+          <w:sz w:val="21"/>
+          <w:szCs w:val="21"/>
+        </w:rPr>
+        <w:t xml:space="preserve">3. La pata 6 del relé a la señal del conector.</w:t>
+      </w:r>
+    </w:p>
+    <w:p>
+      <w:pPr>
+        <w:spacing w:after="120" w:line="290"/>
+      </w:pPr>
+      <w:r>
+        <w:rPr>
+          <w:rFonts w:ascii="IBM Plex Sans" w:cs="IBM Plex Sans" w:eastAsia="IBM Plex Sans" w:hAnsi="IBM Plex Sans"/>
+          <w:sz w:val="21"/>
+          <w:szCs w:val="21"/>
+        </w:rPr>
+        <w:t xml:space="preserve">4. Una resistencia de 10 kΩ ½ W de la señal al − del conector: deja la señal en 0 V (papel) con el relé abierto. La referencia, unida al − de ese mismo conector.</w:t>
+      </w:r>
+    </w:p>
+    <w:p>
+      <w:pPr>
+        <w:spacing w:after="120" w:line="290"/>
+      </w:pPr>
+      <w:r>
+        <w:rPr>
+          <w:rFonts w:ascii="IBM Plex Sans" w:cs="IBM Plex Sans" w:eastAsia="IBM Plex Sans" w:hAnsi="IBM Plex Sans"/>
+          <w:sz w:val="21"/>
+          <w:szCs w:val="21"/>
+        </w:rPr>
+        <w:t xml:space="preserve">5. En control_trama_esp32/config.h, CANAL_ACTIVO_EN_ALTO en true, como viene: relé cerrado = agujero.</w:t>
+      </w:r>
+    </w:p>
     <w:p>
       <w:pPr>
         <w:spacing w:after="60"/>
@@ -6382,25 +6027,7 @@
           <w:sz w:val="21"/>
           <w:szCs w:val="21"/>
         </w:rPr>
-        <w:t xml:space="preserve">Con una bornera de </w:t>
-      </w:r>
-      <w:r>
-        <w:rPr>
-          <w:rFonts w:ascii="IBM Plex Sans" w:cs="IBM Plex Sans" w:eastAsia="IBM Plex Sans" w:hAnsi="IBM Plex Sans"/>
-          <w:b/>
-          <w:bCs/>
-          <w:sz w:val="21"/>
-          <w:szCs w:val="21"/>
-        </w:rPr>
-        <w:t xml:space="preserve">3 vías</w:t>
-      </w:r>
-      <w:r>
-        <w:rPr>
-          <w:rFonts w:ascii="IBM Plex Sans" w:cs="IBM Plex Sans" w:eastAsia="IBM Plex Sans" w:hAnsi="IBM Plex Sans"/>
-          <w:sz w:val="21"/>
-          <w:szCs w:val="21"/>
-        </w:rPr>
-        <w:t xml:space="preserve">, usá los bornes de los extremos y dejá el del medio libre: los dos tornillos quedan más separados. Nunca uses ese borne libre para algo del lado del ESP32.</w:t>
+        <w:t xml:space="preserve">En la bornera del conector, el + (con la resistencia de protección) y el − van en los extremos y la señal en el medio. Las señales de los canales nunca se unen entre sí, y ningún borne del lado del telar se usa para algo del lado del ESP32.</w:t>
       </w:r>
     </w:p>
     <w:p>
@@ -6446,42 +6073,28 @@
           </w:tcPr>
           <w:p>
             <w:pPr>
-              <w:spacing w:after="0" w:line="280"/>
-            </w:pPr>
-            <w:r>
-              <w:rPr>
-                <w:rFonts w:ascii="IBM Plex Sans" w:cs="IBM Plex Sans" w:eastAsia="IBM Plex Sans" w:hAnsi="IBM Plex Sans"/>
-                <w:b/>
-                <w:bCs/>
-                <w:color w:val="9C5C0A"/>
+              <w:spacing w:after="120" w:line="290"/>
+            </w:pPr>
+            <w:r>
+              <w:rPr>
+                <w:rFonts w:ascii="IBM Plex Sans" w:cs="IBM Plex Sans" w:eastAsia="IBM Plex Sans" w:hAnsi="IBM Plex Sans"/>
                 <w:sz w:val="21"/>
                 <w:szCs w:val="21"/>
               </w:rPr>
-              <w:t xml:space="preserve">Si va en serie: </w:t>
-            </w:r>
-            <w:r>
-              <w:rPr>
-                <w:rFonts w:ascii="IBM Plex Sans" w:cs="IBM Plex Sans" w:eastAsia="IBM Plex Sans" w:hAnsi="IBM Plex Sans"/>
-                <w:sz w:val="20"/>
-                <w:szCs w:val="20"/>
-              </w:rPr>
-              <w:t xml:space="preserve">con el ESP32 apagado o reiniciándose, los cuatro canales se leen como agujero, así que no hay que tejer con el Nivel 2 apagado. La conexión en paralelo no tiene este problema, porque con el ESP32 apagado la máquina vuelve a depender del lector.</w:t>
-            </w:r>
-          </w:p>
-          <w:p>
-            <w:pPr>
-              <w:spacing w:after="0" w:line="280"/>
-            </w:pPr>
-            <w:r>
-              <w:rPr>
-                <w:rFonts w:ascii="IBM Plex Sans" w:cs="IBM Plex Sans" w:eastAsia="IBM Plex Sans" w:hAnsi="IBM Plex Sans"/>
-                <w:b/>
-                <w:bCs/>
-                <w:color w:val="9C5C0A"/>
+              <w:t xml:space="preserve">Qué pasa en cada situación. Si el ESP32 pide la bobina, el relé se cierra, la señal queda en +V y la bobina se activa. Si no la pide, o el ESP32 está apagado, arrancando o sin red, el relé queda abierto y la resistencia de 10 kΩ deja la señal en 0 V, como con papel: la bobina queda en reposo. Si por un error de cableado la señal o la pata 4 tocaran el −, la resistencia de protección limita la corriente a unos 50 mA y no se daña nada.</w:t>
+            </w:r>
+          </w:p>
+          <w:p>
+            <w:pPr>
+              <w:spacing w:after="120" w:line="290"/>
+            </w:pPr>
+            <w:r>
+              <w:rPr>
+                <w:rFonts w:ascii="IBM Plex Sans" w:cs="IBM Plex Sans" w:eastAsia="IBM Plex Sans" w:hAnsi="IBM Plex Sans"/>
                 <w:sz w:val="21"/>
                 <w:szCs w:val="21"/>
               </w:rPr>
-              <w:t xml:space="preserve">Otra opción es sacar el lector y conectar el relé en su lugar, directo a los bornes de la plaqueta. Ahí la conexión depende de quién pone la tensión de la señal: si la pone la plaqueta, el relé va entre los 2 bornes de señal (caso 1); si la ponía el lector, el relé va entre el + y la señal (caso 2A, el agujero es +V) o entre la señal y el − (caso 2B, el agujero es 0 V), con una resistencia de 10 kΩ ½ W que deja la señal en «papel» con el relé abierto. El paso a paso de la medición y los diagramas de los tres casos están en esp32/documentacion/PASO_A_PASO_RELES_LCA110.md y en diagramas/hardware (diagrama_bloque_D_caso1, caso2A y caso2B).</w:t>
+              <w:t xml:space="preserve">Por qué es la más segura: el relé solo toca la señal del lector (pocos mA), nunca las bobinas ni su alimentación; el ESP32 y el telar quedan aislados; el LCA110 es normalmente abierto, así que sin orden la plaqueta ve papel; la corriente queda limitada aun con un error de cableado; no depende de la cinta de papel ni pelea con la salida del lector, que se desconecta; y es reversible. Las conexiones en paralelo o en serie con el lector, que se evaluaron primero, quedan descartadas. Si la medición de la sección 5 diera otra cosa (con agujero la señal va a 0 V, o la tensión la pone la plaqueta), es la variante 2B o el caso 1: el paso a paso está en esp32/documentacion/PASO_A_PASO_RELES_LCA110.md y los diagramas en diagramas/hardware.</w:t>
             </w:r>
           </w:p>
         </w:tc>
@@ -6511,43 +6124,7 @@
           <w:sz w:val="21"/>
           <w:szCs w:val="21"/>
         </w:rPr>
-        <w:t xml:space="preserve">El relé actúa </w:t>
-      </w:r>
-      <w:r>
-        <w:rPr>
-          <w:rFonts w:ascii="IBM Plex Sans" w:cs="IBM Plex Sans" w:eastAsia="IBM Plex Sans" w:hAnsi="IBM Plex Sans"/>
-          <w:b/>
-          <w:bCs/>
-          <w:sz w:val="21"/>
-          <w:szCs w:val="21"/>
-        </w:rPr>
-        <w:t xml:space="preserve">junto con</w:t>
-      </w:r>
-      <w:r>
-        <w:rPr>
-          <w:rFonts w:ascii="IBM Plex Sans" w:cs="IBM Plex Sans" w:eastAsia="IBM Plex Sans" w:hAnsi="IBM Plex Sans"/>
-          <w:sz w:val="21"/>
-          <w:szCs w:val="21"/>
-        </w:rPr>
-        <w:t xml:space="preserve"> el lector, no en su lugar. Para que el dibujo lo decida el ESP32, el lector tiene que ver siempre </w:t>
-      </w:r>
-      <w:r>
-        <w:rPr>
-          <w:rFonts w:ascii="IBM Plex Sans" w:cs="IBM Plex Sans" w:eastAsia="IBM Plex Sans" w:hAnsi="IBM Plex Sans"/>
-          <w:b/>
-          <w:bCs/>
-          <w:sz w:val="21"/>
-          <w:szCs w:val="21"/>
-        </w:rPr>
-        <w:t xml:space="preserve">cinta sin agujero</w:t>
-      </w:r>
-      <w:r>
-        <w:rPr>
-          <w:rFonts w:ascii="IBM Plex Sans" w:cs="IBM Plex Sans" w:eastAsia="IBM Plex Sans" w:hAnsi="IBM Plex Sans"/>
-          <w:sz w:val="21"/>
-          <w:szCs w:val="21"/>
-        </w:rPr>
-        <w:t xml:space="preserve">: dejá colocada una cinta sin perforar, o tapá el lector. Sin cinta, el lector ve luz todo el tiempo, que equivale a un agujero en cada pasada, y el ESP32 no podría controlar ese canal.</w:t>
+        <w:t xml:space="preserve">Con la conexión final el lector queda desconectado y la cinta de papel ya no interviene: el dibujo lo decide el ESP32. Para volver a tejer con la cinta (por ejemplo, si se saca el sistema), se vuelven a conectar los cables del lector en su bornera.</w:t>
       </w:r>
     </w:p>
     <w:p>
@@ -6642,7 +6219,7 @@
           <w:sz w:val="21"/>
           <w:szCs w:val="21"/>
         </w:rPr>
-        <w:t xml:space="preserve">Con el telar en marcha lenta, verificá que la bobina 1 responda a lo que marca el dibujo, y no a la cinta.</w:t>
+        <w:t xml:space="preserve">Con el telar en marcha lenta, verificá que la bobina 1 responda a lo que marca el dibujo.</w:t>
       </w:r>
     </w:p>
     <w:p>
@@ -6678,7 +6255,7 @@
           <w:sz w:val="21"/>
           <w:szCs w:val="21"/>
         </w:rPr>
-        <w:t xml:space="preserve">Apagá el ESP32 y fijate qué hace la máquina: tiene que coincidir con la última fila de la tabla de la sección 8.</w:t>
+        <w:t xml:space="preserve">Apagá el ESP32: la bobina 1 tiene que quedar en reposo (relé abierto = papel).</w:t>
       </w:r>
     </w:p>
     <w:p>
@@ -6732,7 +6309,7 @@
           <w:sz w:val="21"/>
           <w:szCs w:val="21"/>
         </w:rPr>
-        <w:t xml:space="preserve"> viene en 0: el relé queda cerrado mientras la misma bobina se repite (por ejemplo, 120 pasadas seguidas de la bobina 1) y cambia recién cuando cambia la bobina. Si se pone entre 1 y 90, el relé se suelta en cada pasada, como hace el papel, y queda cerrado ese porcentaje de la pasada, adaptándose solo a la velocidad. </w:t>
+        <w:t xml:space="preserve"> viene en 0: el relé queda cerrado mientras la misma bobina se repite (por ejemplo, 120 pasadas seguidas de la bobina 1) y cambia recién cuando cambia la bobina. Así lo confirmaron en la planta: el relé del telar queda activo y la aguja va y vuelve igual en cada pasada. Si se pone entre 1 y 90, el relé se suelta en cada pasada, como hace el papel, y queda cerrado ese porcentaje de la pasada, adaptándose solo a la velocidad. </w:t>
       </w:r>
       <w:r>
         <w:rPr>
@@ -7322,7 +6899,7 @@
                 <w:sz w:val="19"/>
                 <w:szCs w:val="19"/>
               </w:rPr>
-              <w:t xml:space="preserve">Relé dañado, o cinta con agujeros en ese lector</w:t>
+              <w:t xml:space="preserve">Relé dañado, o la señal unida al + por un error de cableado</w:t>
             </w:r>
           </w:p>
         </w:tc>
@@ -7355,7 +6932,7 @@
                 <w:sz w:val="19"/>
                 <w:szCs w:val="19"/>
               </w:rPr>
-              <w:t xml:space="preserve">Probar el relé en la mesa; revisar la cinta</w:t>
+              <w:t xml:space="preserve">Probar el relé en la mesa; revisar la conexión con la sección 8</w:t>
             </w:r>
           </w:p>
         </w:tc>
@@ -7427,7 +7004,7 @@
                 <w:sz w:val="19"/>
                 <w:szCs w:val="19"/>
               </w:rPr>
-              <w:t xml:space="preserve">Configuración de paralelo y serie cruzada</w:t>
+              <w:t xml:space="preserve">CANAL_ACTIVO_EN_ALTO en false, o el lector era del caso 2B</w:t>
             </w:r>
           </w:p>
         </w:tc>
@@ -7460,7 +7037,7 @@
                 <w:sz w:val="19"/>
                 <w:szCs w:val="19"/>
               </w:rPr>
-              <w:t xml:space="preserve">Revisar CANAL_ACTIVO_EN_ALTO según la sección 8</w:t>
+              <w:t xml:space="preserve">Dejarlo en true y repetir la medición de la sección 5</w:t>
             </w:r>
           </w:p>
         </w:tc>
@@ -7479,27 +7056,27 @@
               <w:bottom w:val="single" w:color="CDD8E0" w:sz="4"/>
               <w:right w:val="single" w:color="CDD8E0" w:sz="4"/>
             </w:tcBorders>
-            <w:shd w:fill="EDF1F5" w:color="auto" w:val="clear"/>
-            <w:tcMar>
-              <w:top w:type="dxa" w:w="70"/>
-              <w:left w:type="dxa" w:w="110"/>
-              <w:bottom w:type="dxa" w:w="70"/>
-              <w:right w:type="dxa" w:w="110"/>
-            </w:tcMar>
-          </w:tcPr>
-          <w:p>
-            <w:pPr>
-              <w:keepNext/>
-              <w:keepLines/>
-              <w:spacing w:after="0" w:line="260"/>
-            </w:pPr>
-            <w:r>
-              <w:rPr>
-                <w:rFonts w:ascii="IBM Plex Sans" w:cs="IBM Plex Sans" w:eastAsia="IBM Plex Sans" w:hAnsi="IBM Plex Sans"/>
-                <w:sz w:val="19"/>
-                <w:szCs w:val="19"/>
-              </w:rPr>
-              <w:t xml:space="preserve">La bobina que responde no es la del dibujo</w:t>
+            <w:shd w:fill="FFFFFF" w:color="auto" w:val="clear"/>
+            <w:tcMar>
+              <w:top w:type="dxa" w:w="70"/>
+              <w:left w:type="dxa" w:w="110"/>
+              <w:bottom w:type="dxa" w:w="70"/>
+              <w:right w:type="dxa" w:w="110"/>
+            </w:tcMar>
+          </w:tcPr>
+          <w:p>
+            <w:pPr>
+              <w:keepNext/>
+              <w:keepLines/>
+              <w:spacing w:after="0" w:line="260"/>
+            </w:pPr>
+            <w:r>
+              <w:rPr>
+                <w:rFonts w:ascii="IBM Plex Sans" w:cs="IBM Plex Sans" w:eastAsia="IBM Plex Sans" w:hAnsi="IBM Plex Sans"/>
+                <w:sz w:val="19"/>
+                <w:szCs w:val="19"/>
+              </w:rPr>
+              <w:t xml:space="preserve">La resistencia de protección se calienta</w:t>
             </w:r>
           </w:p>
         </w:tc>
@@ -7512,27 +7089,27 @@
               <w:bottom w:val="single" w:color="CDD8E0" w:sz="4"/>
               <w:right w:val="single" w:color="CDD8E0" w:sz="4"/>
             </w:tcBorders>
-            <w:shd w:fill="EDF1F5" w:color="auto" w:val="clear"/>
-            <w:tcMar>
-              <w:top w:type="dxa" w:w="70"/>
-              <w:left w:type="dxa" w:w="110"/>
-              <w:bottom w:type="dxa" w:w="70"/>
-              <w:right w:type="dxa" w:w="110"/>
-            </w:tcMar>
-          </w:tcPr>
-          <w:p>
-            <w:pPr>
-              <w:keepNext/>
-              <w:keepLines/>
-              <w:spacing w:after="0" w:line="260"/>
-            </w:pPr>
-            <w:r>
-              <w:rPr>
-                <w:rFonts w:ascii="IBM Plex Sans" w:cs="IBM Plex Sans" w:eastAsia="IBM Plex Sans" w:hAnsi="IBM Plex Sans"/>
-                <w:sz w:val="19"/>
-                <w:szCs w:val="19"/>
-              </w:rPr>
-              <w:t xml:space="preserve">Canales conectados en otro orden</w:t>
+            <w:shd w:fill="FFFFFF" w:color="auto" w:val="clear"/>
+            <w:tcMar>
+              <w:top w:type="dxa" w:w="70"/>
+              <w:left w:type="dxa" w:w="110"/>
+              <w:bottom w:type="dxa" w:w="70"/>
+              <w:right w:type="dxa" w:w="110"/>
+            </w:tcMar>
+          </w:tcPr>
+          <w:p>
+            <w:pPr>
+              <w:keepNext/>
+              <w:keepLines/>
+              <w:spacing w:after="0" w:line="260"/>
+            </w:pPr>
+            <w:r>
+              <w:rPr>
+                <w:rFonts w:ascii="IBM Plex Sans" w:cs="IBM Plex Sans" w:eastAsia="IBM Plex Sans" w:hAnsi="IBM Plex Sans"/>
+                <w:sz w:val="19"/>
+                <w:szCs w:val="19"/>
+              </w:rPr>
+              <w:t xml:space="preserve">Un cortocircuito en ese canal: la señal o la pata 4 tocan el −</w:t>
             </w:r>
           </w:p>
         </w:tc>
@@ -7545,27 +7122,27 @@
               <w:bottom w:val="single" w:color="CDD8E0" w:sz="4"/>
               <w:right w:val="single" w:color="CDD8E0" w:sz="4"/>
             </w:tcBorders>
-            <w:shd w:fill="EDF1F5" w:color="auto" w:val="clear"/>
-            <w:tcMar>
-              <w:top w:type="dxa" w:w="70"/>
-              <w:left w:type="dxa" w:w="110"/>
-              <w:bottom w:type="dxa" w:w="70"/>
-              <w:right w:type="dxa" w:w="110"/>
-            </w:tcMar>
-          </w:tcPr>
-          <w:p>
-            <w:pPr>
-              <w:keepNext/>
-              <w:keepLines/>
-              <w:spacing w:after="0" w:line="260"/>
-            </w:pPr>
-            <w:r>
-              <w:rPr>
-                <w:rFonts w:ascii="IBM Plex Sans" w:cs="IBM Plex Sans" w:eastAsia="IBM Plex Sans" w:hAnsi="IBM Plex Sans"/>
-                <w:sz w:val="19"/>
-                <w:szCs w:val="19"/>
-              </w:rPr>
-              <w:t xml:space="preserve">Corregir según la tabla de la sección 7</w:t>
+            <w:shd w:fill="FFFFFF" w:color="auto" w:val="clear"/>
+            <w:tcMar>
+              <w:top w:type="dxa" w:w="70"/>
+              <w:left w:type="dxa" w:w="110"/>
+              <w:bottom w:type="dxa" w:w="70"/>
+              <w:right w:type="dxa" w:w="110"/>
+            </w:tcMar>
+          </w:tcPr>
+          <w:p>
+            <w:pPr>
+              <w:keepNext/>
+              <w:keepLines/>
+              <w:spacing w:after="0" w:line="260"/>
+            </w:pPr>
+            <w:r>
+              <w:rPr>
+                <w:rFonts w:ascii="IBM Plex Sans" w:cs="IBM Plex Sans" w:eastAsia="IBM Plex Sans" w:hAnsi="IBM Plex Sans"/>
+                <w:sz w:val="19"/>
+                <w:szCs w:val="19"/>
+              </w:rPr>
+              <w:t xml:space="preserve">Apagar el telar y revisar el cableado del canal</w:t>
             </w:r>
           </w:p>
         </w:tc>
@@ -7584,27 +7161,27 @@
               <w:bottom w:val="single" w:color="CDD8E0" w:sz="4"/>
               <w:right w:val="single" w:color="CDD8E0" w:sz="4"/>
             </w:tcBorders>
-            <w:shd w:fill="FFFFFF" w:color="auto" w:val="clear"/>
-            <w:tcMar>
-              <w:top w:type="dxa" w:w="70"/>
-              <w:left w:type="dxa" w:w="110"/>
-              <w:bottom w:type="dxa" w:w="70"/>
-              <w:right w:type="dxa" w:w="110"/>
-            </w:tcMar>
-          </w:tcPr>
-          <w:p>
-            <w:pPr>
-              <w:keepNext/>
-              <w:keepLines/>
-              <w:spacing w:after="0" w:line="260"/>
-            </w:pPr>
-            <w:r>
-              <w:rPr>
-                <w:rFonts w:ascii="IBM Plex Sans" w:cs="IBM Plex Sans" w:eastAsia="IBM Plex Sans" w:hAnsi="IBM Plex Sans"/>
-                <w:sz w:val="19"/>
-                <w:szCs w:val="19"/>
-              </w:rPr>
-              <w:t xml:space="preserve">Al encender el ESP32 un relé se activa solo</w:t>
+            <w:shd w:fill="EDF1F5" w:color="auto" w:val="clear"/>
+            <w:tcMar>
+              <w:top w:type="dxa" w:w="70"/>
+              <w:left w:type="dxa" w:w="110"/>
+              <w:bottom w:type="dxa" w:w="70"/>
+              <w:right w:type="dxa" w:w="110"/>
+            </w:tcMar>
+          </w:tcPr>
+          <w:p>
+            <w:pPr>
+              <w:keepNext/>
+              <w:keepLines/>
+              <w:spacing w:after="0" w:line="260"/>
+            </w:pPr>
+            <w:r>
+              <w:rPr>
+                <w:rFonts w:ascii="IBM Plex Sans" w:cs="IBM Plex Sans" w:eastAsia="IBM Plex Sans" w:hAnsi="IBM Plex Sans"/>
+                <w:sz w:val="19"/>
+                <w:szCs w:val="19"/>
+              </w:rPr>
+              <w:t xml:space="preserve">La bobina que responde no es la del dibujo</w:t>
             </w:r>
           </w:p>
         </w:tc>
@@ -7617,27 +7194,27 @@
               <w:bottom w:val="single" w:color="CDD8E0" w:sz="4"/>
               <w:right w:val="single" w:color="CDD8E0" w:sz="4"/>
             </w:tcBorders>
-            <w:shd w:fill="FFFFFF" w:color="auto" w:val="clear"/>
-            <w:tcMar>
-              <w:top w:type="dxa" w:w="70"/>
-              <w:left w:type="dxa" w:w="110"/>
-              <w:bottom w:type="dxa" w:w="70"/>
-              <w:right w:type="dxa" w:w="110"/>
-            </w:tcMar>
-          </w:tcPr>
-          <w:p>
-            <w:pPr>
-              <w:keepNext/>
-              <w:keepLines/>
-              <w:spacing w:after="0" w:line="260"/>
-            </w:pPr>
-            <w:r>
-              <w:rPr>
-                <w:rFonts w:ascii="IBM Plex Sans" w:cs="IBM Plex Sans" w:eastAsia="IBM Plex Sans" w:hAnsi="IBM Plex Sans"/>
-                <w:sz w:val="19"/>
-                <w:szCs w:val="19"/>
-              </w:rPr>
-              <w:t xml:space="preserve">Falta la resistencia de 10 kΩ</w:t>
+            <w:shd w:fill="EDF1F5" w:color="auto" w:val="clear"/>
+            <w:tcMar>
+              <w:top w:type="dxa" w:w="70"/>
+              <w:left w:type="dxa" w:w="110"/>
+              <w:bottom w:type="dxa" w:w="70"/>
+              <w:right w:type="dxa" w:w="110"/>
+            </w:tcMar>
+          </w:tcPr>
+          <w:p>
+            <w:pPr>
+              <w:keepNext/>
+              <w:keepLines/>
+              <w:spacing w:after="0" w:line="260"/>
+            </w:pPr>
+            <w:r>
+              <w:rPr>
+                <w:rFonts w:ascii="IBM Plex Sans" w:cs="IBM Plex Sans" w:eastAsia="IBM Plex Sans" w:hAnsi="IBM Plex Sans"/>
+                <w:sz w:val="19"/>
+                <w:szCs w:val="19"/>
+              </w:rPr>
+              <w:t xml:space="preserve">Canales conectados en otro orden</w:t>
             </w:r>
           </w:p>
         </w:tc>
@@ -7650,27 +7227,27 @@
               <w:bottom w:val="single" w:color="CDD8E0" w:sz="4"/>
               <w:right w:val="single" w:color="CDD8E0" w:sz="4"/>
             </w:tcBorders>
-            <w:shd w:fill="FFFFFF" w:color="auto" w:val="clear"/>
-            <w:tcMar>
-              <w:top w:type="dxa" w:w="70"/>
-              <w:left w:type="dxa" w:w="110"/>
-              <w:bottom w:type="dxa" w:w="70"/>
-              <w:right w:type="dxa" w:w="110"/>
-            </w:tcMar>
-          </w:tcPr>
-          <w:p>
-            <w:pPr>
-              <w:keepNext/>
-              <w:keepLines/>
-              <w:spacing w:after="0" w:line="260"/>
-            </w:pPr>
-            <w:r>
-              <w:rPr>
-                <w:rFonts w:ascii="IBM Plex Sans" w:cs="IBM Plex Sans" w:eastAsia="IBM Plex Sans" w:hAnsi="IBM Plex Sans"/>
-                <w:sz w:val="19"/>
-                <w:szCs w:val="19"/>
-              </w:rPr>
-              <w:t xml:space="preserve">Colocarla entre el pin y GND</w:t>
+            <w:shd w:fill="EDF1F5" w:color="auto" w:val="clear"/>
+            <w:tcMar>
+              <w:top w:type="dxa" w:w="70"/>
+              <w:left w:type="dxa" w:w="110"/>
+              <w:bottom w:type="dxa" w:w="70"/>
+              <w:right w:type="dxa" w:w="110"/>
+            </w:tcMar>
+          </w:tcPr>
+          <w:p>
+            <w:pPr>
+              <w:keepNext/>
+              <w:keepLines/>
+              <w:spacing w:after="0" w:line="260"/>
+            </w:pPr>
+            <w:r>
+              <w:rPr>
+                <w:rFonts w:ascii="IBM Plex Sans" w:cs="IBM Plex Sans" w:eastAsia="IBM Plex Sans" w:hAnsi="IBM Plex Sans"/>
+                <w:sz w:val="19"/>
+                <w:szCs w:val="19"/>
+              </w:rPr>
+              <w:t xml:space="preserve">Corregir según la tabla de la sección 7</w:t>
             </w:r>
           </w:p>
         </w:tc>
@@ -7689,27 +7266,27 @@
               <w:bottom w:val="single" w:color="CDD8E0" w:sz="4"/>
               <w:right w:val="single" w:color="CDD8E0" w:sz="4"/>
             </w:tcBorders>
-            <w:shd w:fill="EDF1F5" w:color="auto" w:val="clear"/>
-            <w:tcMar>
-              <w:top w:type="dxa" w:w="70"/>
-              <w:left w:type="dxa" w:w="110"/>
-              <w:bottom w:type="dxa" w:w="70"/>
-              <w:right w:type="dxa" w:w="110"/>
-            </w:tcMar>
-          </w:tcPr>
-          <w:p>
-            <w:pPr>
-              <w:keepNext/>
-              <w:keepLines/>
-              <w:spacing w:after="0" w:line="260"/>
-            </w:pPr>
-            <w:r>
-              <w:rPr>
-                <w:rFonts w:ascii="IBM Plex Sans" w:cs="IBM Plex Sans" w:eastAsia="IBM Plex Sans" w:hAnsi="IBM Plex Sans"/>
-                <w:sz w:val="19"/>
-                <w:szCs w:val="19"/>
-              </w:rPr>
-              <w:t xml:space="preserve">Funciona a veces</w:t>
+            <w:shd w:fill="FFFFFF" w:color="auto" w:val="clear"/>
+            <w:tcMar>
+              <w:top w:type="dxa" w:w="70"/>
+              <w:left w:type="dxa" w:w="110"/>
+              <w:bottom w:type="dxa" w:w="70"/>
+              <w:right w:type="dxa" w:w="110"/>
+            </w:tcMar>
+          </w:tcPr>
+          <w:p>
+            <w:pPr>
+              <w:keepNext/>
+              <w:keepLines/>
+              <w:spacing w:after="0" w:line="260"/>
+            </w:pPr>
+            <w:r>
+              <w:rPr>
+                <w:rFonts w:ascii="IBM Plex Sans" w:cs="IBM Plex Sans" w:eastAsia="IBM Plex Sans" w:hAnsi="IBM Plex Sans"/>
+                <w:sz w:val="19"/>
+                <w:szCs w:val="19"/>
+              </w:rPr>
+              <w:t xml:space="preserve">Al encender el ESP32 un relé se activa solo</w:t>
             </w:r>
           </w:p>
         </w:tc>
@@ -7722,27 +7299,27 @@
               <w:bottom w:val="single" w:color="CDD8E0" w:sz="4"/>
               <w:right w:val="single" w:color="CDD8E0" w:sz="4"/>
             </w:tcBorders>
-            <w:shd w:fill="EDF1F5" w:color="auto" w:val="clear"/>
-            <w:tcMar>
-              <w:top w:type="dxa" w:w="70"/>
-              <w:left w:type="dxa" w:w="110"/>
-              <w:bottom w:type="dxa" w:w="70"/>
-              <w:right w:type="dxa" w:w="110"/>
-            </w:tcMar>
-          </w:tcPr>
-          <w:p>
-            <w:pPr>
-              <w:keepNext/>
-              <w:keepLines/>
-              <w:spacing w:after="0" w:line="260"/>
-            </w:pPr>
-            <w:r>
-              <w:rPr>
-                <w:rFonts w:ascii="IBM Plex Sans" w:cs="IBM Plex Sans" w:eastAsia="IBM Plex Sans" w:hAnsi="IBM Plex Sans"/>
-                <w:sz w:val="19"/>
-                <w:szCs w:val="19"/>
-              </w:rPr>
-              <w:t xml:space="preserve">Soldadura fría o LED con poca corriente</w:t>
+            <w:shd w:fill="FFFFFF" w:color="auto" w:val="clear"/>
+            <w:tcMar>
+              <w:top w:type="dxa" w:w="70"/>
+              <w:left w:type="dxa" w:w="110"/>
+              <w:bottom w:type="dxa" w:w="70"/>
+              <w:right w:type="dxa" w:w="110"/>
+            </w:tcMar>
+          </w:tcPr>
+          <w:p>
+            <w:pPr>
+              <w:keepNext/>
+              <w:keepLines/>
+              <w:spacing w:after="0" w:line="260"/>
+            </w:pPr>
+            <w:r>
+              <w:rPr>
+                <w:rFonts w:ascii="IBM Plex Sans" w:cs="IBM Plex Sans" w:eastAsia="IBM Plex Sans" w:hAnsi="IBM Plex Sans"/>
+                <w:sz w:val="19"/>
+                <w:szCs w:val="19"/>
+              </w:rPr>
+              <w:t xml:space="preserve">Falta la resistencia de 10 kΩ</w:t>
             </w:r>
           </w:p>
         </w:tc>
@@ -7755,27 +7332,27 @@
               <w:bottom w:val="single" w:color="CDD8E0" w:sz="4"/>
               <w:right w:val="single" w:color="CDD8E0" w:sz="4"/>
             </w:tcBorders>
-            <w:shd w:fill="EDF1F5" w:color="auto" w:val="clear"/>
-            <w:tcMar>
-              <w:top w:type="dxa" w:w="70"/>
-              <w:left w:type="dxa" w:w="110"/>
-              <w:bottom w:type="dxa" w:w="70"/>
-              <w:right w:type="dxa" w:w="110"/>
-            </w:tcMar>
-          </w:tcPr>
-          <w:p>
-            <w:pPr>
-              <w:keepNext/>
-              <w:keepLines/>
-              <w:spacing w:after="0" w:line="260"/>
-            </w:pPr>
-            <w:r>
-              <w:rPr>
-                <w:rFonts w:ascii="IBM Plex Sans" w:cs="IBM Plex Sans" w:eastAsia="IBM Plex Sans" w:hAnsi="IBM Plex Sans"/>
-                <w:sz w:val="19"/>
-                <w:szCs w:val="19"/>
-              </w:rPr>
-              <w:t xml:space="preserve">Resoldar; si sigue, bajar la resistencia a 220 Ω</w:t>
+            <w:shd w:fill="FFFFFF" w:color="auto" w:val="clear"/>
+            <w:tcMar>
+              <w:top w:type="dxa" w:w="70"/>
+              <w:left w:type="dxa" w:w="110"/>
+              <w:bottom w:type="dxa" w:w="70"/>
+              <w:right w:type="dxa" w:w="110"/>
+            </w:tcMar>
+          </w:tcPr>
+          <w:p>
+            <w:pPr>
+              <w:keepNext/>
+              <w:keepLines/>
+              <w:spacing w:after="0" w:line="260"/>
+            </w:pPr>
+            <w:r>
+              <w:rPr>
+                <w:rFonts w:ascii="IBM Plex Sans" w:cs="IBM Plex Sans" w:eastAsia="IBM Plex Sans" w:hAnsi="IBM Plex Sans"/>
+                <w:sz w:val="19"/>
+                <w:szCs w:val="19"/>
+              </w:rPr>
+              <w:t xml:space="preserve">Colocarla entre el pin y GND</w:t>
             </w:r>
           </w:p>
         </w:tc>
@@ -7794,27 +7371,27 @@
               <w:bottom w:val="single" w:color="CDD8E0" w:sz="4"/>
               <w:right w:val="single" w:color="CDD8E0" w:sz="4"/>
             </w:tcBorders>
-            <w:shd w:fill="FFFFFF" w:color="auto" w:val="clear"/>
-            <w:tcMar>
-              <w:top w:type="dxa" w:w="70"/>
-              <w:left w:type="dxa" w:w="110"/>
-              <w:bottom w:type="dxa" w:w="70"/>
-              <w:right w:type="dxa" w:w="110"/>
-            </w:tcMar>
-          </w:tcPr>
-          <w:p>
-            <w:pPr>
-              <w:keepNext/>
-              <w:keepLines/>
-              <w:spacing w:after="0" w:line="260"/>
-            </w:pPr>
-            <w:r>
-              <w:rPr>
-                <w:rFonts w:ascii="IBM Plex Sans" w:cs="IBM Plex Sans" w:eastAsia="IBM Plex Sans" w:hAnsi="IBM Plex Sans"/>
-                <w:sz w:val="19"/>
-                <w:szCs w:val="19"/>
-              </w:rPr>
-              <w:t xml:space="preserve">En una fila repetida solo toma la primera pasada</w:t>
+            <w:shd w:fill="EDF1F5" w:color="auto" w:val="clear"/>
+            <w:tcMar>
+              <w:top w:type="dxa" w:w="70"/>
+              <w:left w:type="dxa" w:w="110"/>
+              <w:bottom w:type="dxa" w:w="70"/>
+              <w:right w:type="dxa" w:w="110"/>
+            </w:tcMar>
+          </w:tcPr>
+          <w:p>
+            <w:pPr>
+              <w:keepNext/>
+              <w:keepLines/>
+              <w:spacing w:after="0" w:line="260"/>
+            </w:pPr>
+            <w:r>
+              <w:rPr>
+                <w:rFonts w:ascii="IBM Plex Sans" w:cs="IBM Plex Sans" w:eastAsia="IBM Plex Sans" w:hAnsi="IBM Plex Sans"/>
+                <w:sz w:val="19"/>
+                <w:szCs w:val="19"/>
+              </w:rPr>
+              <w:t xml:space="preserve">Funciona a veces</w:t>
             </w:r>
           </w:p>
         </w:tc>
@@ -7827,27 +7404,27 @@
               <w:bottom w:val="single" w:color="CDD8E0" w:sz="4"/>
               <w:right w:val="single" w:color="CDD8E0" w:sz="4"/>
             </w:tcBorders>
-            <w:shd w:fill="FFFFFF" w:color="auto" w:val="clear"/>
-            <w:tcMar>
-              <w:top w:type="dxa" w:w="70"/>
-              <w:left w:type="dxa" w:w="110"/>
-              <w:bottom w:type="dxa" w:w="70"/>
-              <w:right w:type="dxa" w:w="110"/>
-            </w:tcMar>
-          </w:tcPr>
-          <w:p>
-            <w:pPr>
-              <w:keepNext/>
-              <w:keepLines/>
-              <w:spacing w:after="0" w:line="260"/>
-            </w:pPr>
-            <w:r>
-              <w:rPr>
-                <w:rFonts w:ascii="IBM Plex Sans" w:cs="IBM Plex Sans" w:eastAsia="IBM Plex Sans" w:hAnsi="IBM Plex Sans"/>
-                <w:sz w:val="19"/>
-                <w:szCs w:val="19"/>
-              </w:rPr>
-              <w:t xml:space="preserve">La máquina necesita que la señal se suelte entre pasadas, como con el papel</w:t>
+            <w:shd w:fill="EDF1F5" w:color="auto" w:val="clear"/>
+            <w:tcMar>
+              <w:top w:type="dxa" w:w="70"/>
+              <w:left w:type="dxa" w:w="110"/>
+              <w:bottom w:type="dxa" w:w="70"/>
+              <w:right w:type="dxa" w:w="110"/>
+            </w:tcMar>
+          </w:tcPr>
+          <w:p>
+            <w:pPr>
+              <w:keepNext/>
+              <w:keepLines/>
+              <w:spacing w:after="0" w:line="260"/>
+            </w:pPr>
+            <w:r>
+              <w:rPr>
+                <w:rFonts w:ascii="IBM Plex Sans" w:cs="IBM Plex Sans" w:eastAsia="IBM Plex Sans" w:hAnsi="IBM Plex Sans"/>
+                <w:sz w:val="19"/>
+                <w:szCs w:val="19"/>
+              </w:rPr>
+              <w:t xml:space="preserve">Soldadura fría o LED con poca corriente</w:t>
             </w:r>
           </w:p>
         </w:tc>
@@ -7860,27 +7437,27 @@
               <w:bottom w:val="single" w:color="CDD8E0" w:sz="4"/>
               <w:right w:val="single" w:color="CDD8E0" w:sz="4"/>
             </w:tcBorders>
-            <w:shd w:fill="FFFFFF" w:color="auto" w:val="clear"/>
-            <w:tcMar>
-              <w:top w:type="dxa" w:w="70"/>
-              <w:left w:type="dxa" w:w="110"/>
-              <w:bottom w:type="dxa" w:w="70"/>
-              <w:right w:type="dxa" w:w="110"/>
-            </w:tcMar>
-          </w:tcPr>
-          <w:p>
-            <w:pPr>
-              <w:keepNext/>
-              <w:keepLines/>
-              <w:spacing w:after="0" w:line="260"/>
-            </w:pPr>
-            <w:r>
-              <w:rPr>
-                <w:rFonts w:ascii="IBM Plex Sans" w:cs="IBM Plex Sans" w:eastAsia="IBM Plex Sans" w:hAnsi="IBM Plex Sans"/>
-                <w:sz w:val="19"/>
-                <w:szCs w:val="19"/>
-              </w:rPr>
-              <w:t xml:space="preserve">Poner PORCENTAJE_SELECCION en 50 (o el valor medido con la regla); el LED de la prueba en la mesa pasa a parpadear</w:t>
+            <w:shd w:fill="EDF1F5" w:color="auto" w:val="clear"/>
+            <w:tcMar>
+              <w:top w:type="dxa" w:w="70"/>
+              <w:left w:type="dxa" w:w="110"/>
+              <w:bottom w:type="dxa" w:w="70"/>
+              <w:right w:type="dxa" w:w="110"/>
+            </w:tcMar>
+          </w:tcPr>
+          <w:p>
+            <w:pPr>
+              <w:keepNext/>
+              <w:keepLines/>
+              <w:spacing w:after="0" w:line="260"/>
+            </w:pPr>
+            <w:r>
+              <w:rPr>
+                <w:rFonts w:ascii="IBM Plex Sans" w:cs="IBM Plex Sans" w:eastAsia="IBM Plex Sans" w:hAnsi="IBM Plex Sans"/>
+                <w:sz w:val="19"/>
+                <w:szCs w:val="19"/>
+              </w:rPr>
+              <w:t xml:space="preserve">Resoldar; si sigue, bajar la resistencia a 220 Ω</w:t>
             </w:r>
           </w:p>
         </w:tc>
@@ -7899,27 +7476,27 @@
               <w:bottom w:val="single" w:color="CDD8E0" w:sz="4"/>
               <w:right w:val="single" w:color="CDD8E0" w:sz="4"/>
             </w:tcBorders>
-            <w:shd w:fill="EDF1F5" w:color="auto" w:val="clear"/>
-            <w:tcMar>
-              <w:top w:type="dxa" w:w="70"/>
-              <w:left w:type="dxa" w:w="110"/>
-              <w:bottom w:type="dxa" w:w="70"/>
-              <w:right w:type="dxa" w:w="110"/>
-            </w:tcMar>
-          </w:tcPr>
-          <w:p>
-            <w:pPr>
-              <w:keepNext/>
-              <w:keepLines/>
-              <w:spacing w:after="0" w:line="260"/>
-            </w:pPr>
-            <w:r>
-              <w:rPr>
-                <w:rFonts w:ascii="IBM Plex Sans" w:cs="IBM Plex Sans" w:eastAsia="IBM Plex Sans" w:hAnsi="IBM Plex Sans"/>
-                <w:sz w:val="19"/>
-                <w:szCs w:val="19"/>
-              </w:rPr>
-              <w:t xml:space="preserve">Algunas pasadas no toman la selección</w:t>
+            <w:shd w:fill="FFFFFF" w:color="auto" w:val="clear"/>
+            <w:tcMar>
+              <w:top w:type="dxa" w:w="70"/>
+              <w:left w:type="dxa" w:w="110"/>
+              <w:bottom w:type="dxa" w:w="70"/>
+              <w:right w:type="dxa" w:w="110"/>
+            </w:tcMar>
+          </w:tcPr>
+          <w:p>
+            <w:pPr>
+              <w:keepNext/>
+              <w:keepLines/>
+              <w:spacing w:after="0" w:line="260"/>
+            </w:pPr>
+            <w:r>
+              <w:rPr>
+                <w:rFonts w:ascii="IBM Plex Sans" w:cs="IBM Plex Sans" w:eastAsia="IBM Plex Sans" w:hAnsi="IBM Plex Sans"/>
+                <w:sz w:val="19"/>
+                <w:szCs w:val="19"/>
+              </w:rPr>
+              <w:t xml:space="preserve">En una fila repetida solo toma la primera pasada</w:t>
             </w:r>
           </w:p>
         </w:tc>
@@ -7932,27 +7509,27 @@
               <w:bottom w:val="single" w:color="CDD8E0" w:sz="4"/>
               <w:right w:val="single" w:color="CDD8E0" w:sz="4"/>
             </w:tcBorders>
-            <w:shd w:fill="EDF1F5" w:color="auto" w:val="clear"/>
-            <w:tcMar>
-              <w:top w:type="dxa" w:w="70"/>
-              <w:left w:type="dxa" w:w="110"/>
-              <w:bottom w:type="dxa" w:w="70"/>
-              <w:right w:type="dxa" w:w="110"/>
-            </w:tcMar>
-          </w:tcPr>
-          <w:p>
-            <w:pPr>
-              <w:keepNext/>
-              <w:keepLines/>
-              <w:spacing w:after="0" w:line="260"/>
-            </w:pPr>
-            <w:r>
-              <w:rPr>
-                <w:rFonts w:ascii="IBM Plex Sans" w:cs="IBM Plex Sans" w:eastAsia="IBM Plex Sans" w:hAnsi="IBM Plex Sans"/>
-                <w:sz w:val="19"/>
-                <w:szCs w:val="19"/>
-              </w:rPr>
-              <w:t xml:space="preserve">Con un porcentaje, la selección dura poco para la máquina</w:t>
+            <w:shd w:fill="FFFFFF" w:color="auto" w:val="clear"/>
+            <w:tcMar>
+              <w:top w:type="dxa" w:w="70"/>
+              <w:left w:type="dxa" w:w="110"/>
+              <w:bottom w:type="dxa" w:w="70"/>
+              <w:right w:type="dxa" w:w="110"/>
+            </w:tcMar>
+          </w:tcPr>
+          <w:p>
+            <w:pPr>
+              <w:keepNext/>
+              <w:keepLines/>
+              <w:spacing w:after="0" w:line="260"/>
+            </w:pPr>
+            <w:r>
+              <w:rPr>
+                <w:rFonts w:ascii="IBM Plex Sans" w:cs="IBM Plex Sans" w:eastAsia="IBM Plex Sans" w:hAnsi="IBM Plex Sans"/>
+                <w:sz w:val="19"/>
+                <w:szCs w:val="19"/>
+              </w:rPr>
+              <w:t xml:space="preserve">La máquina necesita que la señal se suelte entre pasadas, como con el papel</w:t>
             </w:r>
           </w:p>
         </w:tc>
@@ -7965,27 +7542,27 @@
               <w:bottom w:val="single" w:color="CDD8E0" w:sz="4"/>
               <w:right w:val="single" w:color="CDD8E0" w:sz="4"/>
             </w:tcBorders>
-            <w:shd w:fill="EDF1F5" w:color="auto" w:val="clear"/>
-            <w:tcMar>
-              <w:top w:type="dxa" w:w="70"/>
-              <w:left w:type="dxa" w:w="110"/>
-              <w:bottom w:type="dxa" w:w="70"/>
-              <w:right w:type="dxa" w:w="110"/>
-            </w:tcMar>
-          </w:tcPr>
-          <w:p>
-            <w:pPr>
-              <w:keepNext/>
-              <w:keepLines/>
-              <w:spacing w:after="0" w:line="260"/>
-            </w:pPr>
-            <w:r>
-              <w:rPr>
-                <w:rFonts w:ascii="IBM Plex Sans" w:cs="IBM Plex Sans" w:eastAsia="IBM Plex Sans" w:hAnsi="IBM Plex Sans"/>
-                <w:sz w:val="19"/>
-                <w:szCs w:val="19"/>
-              </w:rPr>
-              <w:t xml:space="preserve">Subir PORCENTAJE_SELECCION de a 10, hasta 90 (o volver a 0, que la mantiene)</w:t>
+            <w:shd w:fill="FFFFFF" w:color="auto" w:val="clear"/>
+            <w:tcMar>
+              <w:top w:type="dxa" w:w="70"/>
+              <w:left w:type="dxa" w:w="110"/>
+              <w:bottom w:type="dxa" w:w="70"/>
+              <w:right w:type="dxa" w:w="110"/>
+            </w:tcMar>
+          </w:tcPr>
+          <w:p>
+            <w:pPr>
+              <w:keepNext/>
+              <w:keepLines/>
+              <w:spacing w:after="0" w:line="260"/>
+            </w:pPr>
+            <w:r>
+              <w:rPr>
+                <w:rFonts w:ascii="IBM Plex Sans" w:cs="IBM Plex Sans" w:eastAsia="IBM Plex Sans" w:hAnsi="IBM Plex Sans"/>
+                <w:sz w:val="19"/>
+                <w:szCs w:val="19"/>
+              </w:rPr>
+              <w:t xml:space="preserve">Poner PORCENTAJE_SELECCION en 50 (o el valor medido con la regla); el LED de la prueba en la mesa pasa a parpadear</w:t>
             </w:r>
           </w:p>
         </w:tc>
@@ -8004,6 +7581,111 @@
               <w:bottom w:val="single" w:color="CDD8E0" w:sz="4"/>
               <w:right w:val="single" w:color="CDD8E0" w:sz="4"/>
             </w:tcBorders>
+            <w:shd w:fill="EDF1F5" w:color="auto" w:val="clear"/>
+            <w:tcMar>
+              <w:top w:type="dxa" w:w="70"/>
+              <w:left w:type="dxa" w:w="110"/>
+              <w:bottom w:type="dxa" w:w="70"/>
+              <w:right w:type="dxa" w:w="110"/>
+            </w:tcMar>
+          </w:tcPr>
+          <w:p>
+            <w:pPr>
+              <w:keepNext/>
+              <w:keepLines/>
+              <w:spacing w:after="0" w:line="260"/>
+            </w:pPr>
+            <w:r>
+              <w:rPr>
+                <w:rFonts w:ascii="IBM Plex Sans" w:cs="IBM Plex Sans" w:eastAsia="IBM Plex Sans" w:hAnsi="IBM Plex Sans"/>
+                <w:sz w:val="19"/>
+                <w:szCs w:val="19"/>
+              </w:rPr>
+              <w:t xml:space="preserve">Algunas pasadas no toman la selección</w:t>
+            </w:r>
+          </w:p>
+        </w:tc>
+        <w:tc>
+          <w:tcPr>
+            <w:tcW w:type="dxa" w:w="3300"/>
+            <w:tcBorders>
+              <w:top w:val="single" w:color="CDD8E0" w:sz="4"/>
+              <w:left w:val="single" w:color="CDD8E0" w:sz="4"/>
+              <w:bottom w:val="single" w:color="CDD8E0" w:sz="4"/>
+              <w:right w:val="single" w:color="CDD8E0" w:sz="4"/>
+            </w:tcBorders>
+            <w:shd w:fill="EDF1F5" w:color="auto" w:val="clear"/>
+            <w:tcMar>
+              <w:top w:type="dxa" w:w="70"/>
+              <w:left w:type="dxa" w:w="110"/>
+              <w:bottom w:type="dxa" w:w="70"/>
+              <w:right w:type="dxa" w:w="110"/>
+            </w:tcMar>
+          </w:tcPr>
+          <w:p>
+            <w:pPr>
+              <w:keepNext/>
+              <w:keepLines/>
+              <w:spacing w:after="0" w:line="260"/>
+            </w:pPr>
+            <w:r>
+              <w:rPr>
+                <w:rFonts w:ascii="IBM Plex Sans" w:cs="IBM Plex Sans" w:eastAsia="IBM Plex Sans" w:hAnsi="IBM Plex Sans"/>
+                <w:sz w:val="19"/>
+                <w:szCs w:val="19"/>
+              </w:rPr>
+              <w:t xml:space="preserve">Con un porcentaje, la selección dura poco para la máquina</w:t>
+            </w:r>
+          </w:p>
+        </w:tc>
+        <w:tc>
+          <w:tcPr>
+            <w:tcW w:type="dxa" w:w="3638"/>
+            <w:tcBorders>
+              <w:top w:val="single" w:color="CDD8E0" w:sz="4"/>
+              <w:left w:val="single" w:color="CDD8E0" w:sz="4"/>
+              <w:bottom w:val="single" w:color="CDD8E0" w:sz="4"/>
+              <w:right w:val="single" w:color="CDD8E0" w:sz="4"/>
+            </w:tcBorders>
+            <w:shd w:fill="EDF1F5" w:color="auto" w:val="clear"/>
+            <w:tcMar>
+              <w:top w:type="dxa" w:w="70"/>
+              <w:left w:type="dxa" w:w="110"/>
+              <w:bottom w:type="dxa" w:w="70"/>
+              <w:right w:type="dxa" w:w="110"/>
+            </w:tcMar>
+          </w:tcPr>
+          <w:p>
+            <w:pPr>
+              <w:keepNext/>
+              <w:keepLines/>
+              <w:spacing w:after="0" w:line="260"/>
+            </w:pPr>
+            <w:r>
+              <w:rPr>
+                <w:rFonts w:ascii="IBM Plex Sans" w:cs="IBM Plex Sans" w:eastAsia="IBM Plex Sans" w:hAnsi="IBM Plex Sans"/>
+                <w:sz w:val="19"/>
+                <w:szCs w:val="19"/>
+              </w:rPr>
+              <w:t xml:space="preserve">Subir PORCENTAJE_SELECCION de a 10, hasta 90 (o volver a 0, que la mantiene)</w:t>
+            </w:r>
+          </w:p>
+        </w:tc>
+      </w:tr>
+      <w:tr>
+        <w:trPr>
+          <w:cantSplit/>
+          <w:tblHeader w:val="off"/>
+        </w:trPr>
+        <w:tc>
+          <w:tcPr>
+            <w:tcW w:type="dxa" w:w="2700"/>
+            <w:tcBorders>
+              <w:top w:val="single" w:color="CDD8E0" w:sz="4"/>
+              <w:left w:val="single" w:color="CDD8E0" w:sz="4"/>
+              <w:bottom w:val="single" w:color="CDD8E0" w:sz="4"/>
+              <w:right w:val="single" w:color="CDD8E0" w:sz="4"/>
+            </w:tcBorders>
             <w:shd w:fill="FFFFFF" w:color="auto" w:val="clear"/>
             <w:tcMar>
               <w:top w:type="dxa" w:w="70"/>
@@ -8125,7 +7807,7 @@
           <w:sz w:val="21"/>
           <w:szCs w:val="21"/>
         </w:rPr>
-        <w:t xml:space="preserve">Mediciones de la sección 5 anotadas; corriente del lector menor a 120 mA.</w:t>
+        <w:t xml:space="preserve">Mediciones de la sección 5 anotadas; corriente con el relé cerrado menor a 20 mA (nunca más de 100).</w:t>
       </w:r>
     </w:p>
     <w:p>
@@ -8233,7 +7915,7 @@
           <w:sz w:val="21"/>
           <w:szCs w:val="21"/>
         </w:rPr>
-        <w:t xml:space="preserve">CANAL_ACTIVO_EN_ALTO según paralelo o serie, MODO_BANCO en false y PORCENTAJE_SELECCION ajustado con la prueba de tejido.</w:t>
+        <w:t xml:space="preserve">CANAL_ACTIVO_EN_ALTO en true, MODO_BANCO en false y PORCENTAJE_SELECCION confirmado con la prueba de tejido (0 si la máquina toma la selección mantenida).</w:t>
       </w:r>
     </w:p>
     <w:p>
@@ -8251,7 +7933,7 @@
           <w:sz w:val="21"/>
           <w:szCs w:val="21"/>
         </w:rPr>
-        <w:t xml:space="preserve">Cinta sin perforar colocada, o lectores tapados.</w:t>
+        <w:t xml:space="preserve">En cada canal, la resistencia de protección y la de 10 kΩ ½ W; los cables de cada lector marcados y aislados en su bornera.</w:t>
       </w:r>
     </w:p>
     <w:p>

</xml_diff>